<commit_message>
refactor(reports): standardize error diagnostics with terraform convention
</commit_message>
<xml_diff>
--- a/templates/report.docx
+++ b/templates/report.docx
@@ -1,10 +1,10 @@
 
 <file path=word/document.xml><?xml version="1.0" encoding="utf-8"?>
-<w:document xmlns:wpc="http://schemas.microsoft.com/office/word/2010/wordprocessingCanvas" xmlns:mc="http://schemas.openxmlformats.org/markup-compatibility/2006" xmlns:o="urn:schemas-microsoft-com:office:office" xmlns:r="http://schemas.openxmlformats.org/officeDocument/2006/relationships" xmlns:m="http://schemas.openxmlformats.org/officeDocument/2006/math" xmlns:v="urn:schemas-microsoft-com:vml" xmlns:wp14="http://schemas.microsoft.com/office/word/2010/wordprocessingDrawing" xmlns:wp="http://schemas.openxmlformats.org/drawingml/2006/wordprocessingDrawing" xmlns:w10="urn:schemas-microsoft-com:office:word" xmlns:w="http://schemas.openxmlformats.org/wordprocessingml/2006/main" xmlns:w14="http://schemas.microsoft.com/office/word/2010/wordml" xmlns:w15="http://schemas.microsoft.com/office/word/2012/wordml" xmlns:wpg="http://schemas.microsoft.com/office/word/2010/wordprocessingGroup" xmlns:wpi="http://schemas.microsoft.com/office/word/2010/wordprocessingInk" xmlns:wne="http://schemas.microsoft.com/office/word/2006/wordml" xmlns:wps="http://schemas.microsoft.com/office/word/2010/wordprocessingShape" xmlns:cx="http://schemas.microsoft.com/office/drawing/2014/chartex" xmlns:cx1="http://schemas.microsoft.com/office/drawing/2015/9/8/chartex" xmlns:cx2="http://schemas.microsoft.com/office/drawing/2015/10/21/chartex" xmlns:cx3="http://schemas.microsoft.com/office/drawing/2016/5/9/chartex" xmlns:cx4="http://schemas.microsoft.com/office/drawing/2016/5/10/chartex" xmlns:cx5="http://schemas.microsoft.com/office/drawing/2016/5/11/chartex" xmlns:cx6="http://schemas.microsoft.com/office/drawing/2016/5/12/chartex" xmlns:cx7="http://schemas.microsoft.com/office/drawing/2016/5/13/chartex" xmlns:cx8="http://schemas.microsoft.com/office/drawing/2016/5/14/chartex" xmlns:aink="http://schemas.microsoft.com/office/drawing/2016/ink" xmlns:am3d="http://schemas.microsoft.com/office/drawing/2017/model3d" xmlns:w16cex="http://schemas.microsoft.com/office/word/2018/wordml/cex" xmlns:w16cid="http://schemas.microsoft.com/office/word/2016/wordml/cid" xmlns:w16="http://schemas.microsoft.com/office/word/2018/wordml" xmlns:w16sdtdh="http://schemas.microsoft.com/office/word/2020/wordml/sdtdatahash" xmlns:w16se="http://schemas.microsoft.com/office/word/2015/wordml/symex" mc:Ignorable="w14 w15 wp14">
+<w:document xmlns:wpc="http://schemas.microsoft.com/office/word/2010/wordprocessingCanvas" xmlns:cx="http://schemas.microsoft.com/office/drawing/2014/chartex" xmlns:cx1="http://schemas.microsoft.com/office/drawing/2015/9/8/chartex" xmlns:cx2="http://schemas.microsoft.com/office/drawing/2015/10/21/chartex" xmlns:cx3="http://schemas.microsoft.com/office/drawing/2016/5/9/chartex" xmlns:cx4="http://schemas.microsoft.com/office/drawing/2016/5/10/chartex" xmlns:cx5="http://schemas.microsoft.com/office/drawing/2016/5/11/chartex" xmlns:cx6="http://schemas.microsoft.com/office/drawing/2016/5/12/chartex" xmlns:cx7="http://schemas.microsoft.com/office/drawing/2016/5/13/chartex" xmlns:cx8="http://schemas.microsoft.com/office/drawing/2016/5/14/chartex" xmlns:mc="http://schemas.openxmlformats.org/markup-compatibility/2006" xmlns:aink="http://schemas.microsoft.com/office/drawing/2016/ink" xmlns:am3d="http://schemas.microsoft.com/office/drawing/2017/model3d" xmlns:o="urn:schemas-microsoft-com:office:office" xmlns:oel="http://schemas.microsoft.com/office/2019/extlst" xmlns:r="http://schemas.openxmlformats.org/officeDocument/2006/relationships" xmlns:m="http://schemas.openxmlformats.org/officeDocument/2006/math" xmlns:v="urn:schemas-microsoft-com:vml" xmlns:wp14="http://schemas.microsoft.com/office/word/2010/wordprocessingDrawing" xmlns:wp="http://schemas.openxmlformats.org/drawingml/2006/wordprocessingDrawing" xmlns:w10="urn:schemas-microsoft-com:office:word" xmlns:w="http://schemas.openxmlformats.org/wordprocessingml/2006/main" xmlns:w14="http://schemas.microsoft.com/office/word/2010/wordml" xmlns:w15="http://schemas.microsoft.com/office/word/2012/wordml" xmlns:w16cex="http://schemas.microsoft.com/office/word/2018/wordml/cex" xmlns:w16cid="http://schemas.microsoft.com/office/word/2016/wordml/cid" xmlns:w16="http://schemas.microsoft.com/office/word/2018/wordml" xmlns:w16du="http://schemas.microsoft.com/office/word/2023/wordml/word16du" xmlns:w16sdtdh="http://schemas.microsoft.com/office/word/2020/wordml/sdtdatahash" xmlns:w16sdtfl="http://schemas.microsoft.com/office/word/2024/wordml/sdtformatlock" xmlns:w16se="http://schemas.microsoft.com/office/word/2015/wordml/symex" xmlns:wpg="http://schemas.microsoft.com/office/word/2010/wordprocessingGroup" xmlns:wpi="http://schemas.microsoft.com/office/word/2010/wordprocessingInk" xmlns:wne="http://schemas.microsoft.com/office/word/2006/wordml" xmlns:wps="http://schemas.microsoft.com/office/word/2010/wordprocessingShape" mc:Ignorable="w14 w15 w16se w16cid w16 w16cex w16sdtdh w16sdtfl w16du wp14">
   <w:body>
     <w:p>
       <w:pPr>
-        <w:spacing w:after="100" w:before="320"/>
+        <w:spacing w:before="320" w:after="100"/>
       </w:pPr>
       <w:r>
         <w:rPr>
@@ -14,14 +14,34 @@
           <w:sz w:val="38"/>
           <w:szCs w:val="38"/>
         </w:rPr>
-        <w:t xml:space="preserve">${title}</w:t>
+        <w:t>${</w:t>
+      </w:r>
+      <w:proofErr w:type="spellStart"/>
+      <w:r>
+        <w:rPr>
+          <w:b/>
+          <w:bCs/>
+          <w:color w:val="0F172A"/>
+          <w:sz w:val="38"/>
+          <w:szCs w:val="38"/>
+        </w:rPr>
+        <w:t>title</w:t>
+      </w:r>
+      <w:proofErr w:type="spellEnd"/>
+      <w:r>
+        <w:rPr>
+          <w:b/>
+          <w:bCs/>
+          <w:color w:val="0F172A"/>
+          <w:sz w:val="38"/>
+          <w:szCs w:val="38"/>
+        </w:rPr>
+        <w:t>}</w:t>
       </w:r>
     </w:p>
     <w:p>
       <w:pPr>
-        <w:spacing w:after="360"/>
-      </w:pPr>
-      <w:r>
+        <w:spacing w:before="180" w:after="140"/>
         <w:rPr>
           <w:i/>
           <w:iCs/>
@@ -29,13 +49,67 @@
           <w:sz w:val="20"/>
           <w:szCs w:val="20"/>
         </w:rPr>
-        <w:t xml:space="preserve">Reporte ejecutivo y consolidado de pruebas automatizadas y aseguramiento de calidad (QA).</w:t>
+      </w:pPr>
+      <w:r>
+        <w:rPr>
+          <w:i/>
+          <w:iCs/>
+          <w:color w:val="64748B"/>
+          <w:sz w:val="20"/>
+          <w:szCs w:val="20"/>
+        </w:rPr>
+        <w:t xml:space="preserve">Executive and </w:t>
+      </w:r>
+      <w:proofErr w:type="spellStart"/>
+      <w:r>
+        <w:rPr>
+          <w:i/>
+          <w:iCs/>
+          <w:color w:val="64748B"/>
+          <w:sz w:val="20"/>
+          <w:szCs w:val="20"/>
+        </w:rPr>
+        <w:t>consolidated</w:t>
+      </w:r>
+      <w:proofErr w:type="spellEnd"/>
+      <w:r>
+        <w:rPr>
+          <w:i/>
+          <w:iCs/>
+          <w:color w:val="64748B"/>
+          <w:sz w:val="20"/>
+          <w:szCs w:val="20"/>
+        </w:rPr>
+        <w:t xml:space="preserve"> test </w:t>
+      </w:r>
+      <w:proofErr w:type="spellStart"/>
+      <w:r>
+        <w:rPr>
+          <w:i/>
+          <w:iCs/>
+          <w:color w:val="64748B"/>
+          <w:sz w:val="20"/>
+          <w:szCs w:val="20"/>
+        </w:rPr>
+        <w:t>report</w:t>
+      </w:r>
+      <w:proofErr w:type="spellEnd"/>
+      <w:r>
+        <w:rPr>
+          <w:i/>
+          <w:iCs/>
+          <w:color w:val="64748B"/>
+          <w:sz w:val="20"/>
+          <w:szCs w:val="20"/>
+        </w:rPr>
+        <w:t>.</w:t>
       </w:r>
     </w:p>
     <w:p>
       <w:pPr>
-        <w:spacing w:after="140" w:before="180"/>
+        <w:spacing w:before="180" w:after="140"/>
       </w:pPr>
+      <w:proofErr w:type="spellStart"/>
       <w:r>
         <w:rPr>
           <w:b/>
@@ -44,35 +118,82 @@
           <w:sz w:val="24"/>
           <w:szCs w:val="24"/>
         </w:rPr>
-        <w:t xml:space="preserve">Resumen Ejecutivo de Métricas</w:t>
-      </w:r>
+        <w:t>Summary</w:t>
+      </w:r>
+      <w:proofErr w:type="spellEnd"/>
+      <w:r>
+        <w:rPr>
+          <w:b/>
+          <w:bCs/>
+          <w:color w:val="1E293B"/>
+          <w:sz w:val="24"/>
+          <w:szCs w:val="24"/>
+        </w:rPr>
+        <w:t xml:space="preserve"> </w:t>
+      </w:r>
+      <w:proofErr w:type="spellStart"/>
+      <w:r>
+        <w:rPr>
+          <w:b/>
+          <w:bCs/>
+          <w:color w:val="1E293B"/>
+          <w:sz w:val="24"/>
+          <w:szCs w:val="24"/>
+        </w:rPr>
+        <w:t>of</w:t>
+      </w:r>
+      <w:proofErr w:type="spellEnd"/>
+      <w:r>
+        <w:rPr>
+          <w:b/>
+          <w:bCs/>
+          <w:color w:val="1E293B"/>
+          <w:sz w:val="24"/>
+          <w:szCs w:val="24"/>
+        </w:rPr>
+        <w:t xml:space="preserve"> </w:t>
+      </w:r>
+      <w:proofErr w:type="spellStart"/>
+      <w:r>
+        <w:rPr>
+          <w:b/>
+          <w:bCs/>
+          <w:color w:val="1E293B"/>
+          <w:sz w:val="24"/>
+          <w:szCs w:val="24"/>
+        </w:rPr>
+        <w:t>Metrics</w:t>
+      </w:r>
+      <w:proofErr w:type="spellEnd"/>
     </w:p>
     <w:tbl>
       <w:tblPr>
-        <w:tblW w:type="pct" w:w="5000"/>
+        <w:tblW w:w="5000" w:type="pct"/>
         <w:tblBorders>
-          <w:top w:val="single" w:color="CBD5E1" w:sz="6"/>
-          <w:left w:val="single" w:color="CBD5E1" w:sz="6"/>
-          <w:bottom w:val="single" w:color="CBD5E1" w:sz="6"/>
-          <w:right w:val="single" w:color="CBD5E1" w:sz="6"/>
-          <w:insideH w:val="single" w:color="E2E8F0" w:sz="4"/>
-          <w:insideV w:val="single" w:color="E2E8F0" w:sz="4"/>
+          <w:top w:val="single" w:sz="6" w:space="0" w:color="CBD5E1"/>
+          <w:left w:val="single" w:sz="6" w:space="0" w:color="CBD5E1"/>
+          <w:bottom w:val="single" w:sz="6" w:space="0" w:color="CBD5E1"/>
+          <w:right w:val="single" w:sz="6" w:space="0" w:color="CBD5E1"/>
+          <w:insideH w:val="single" w:sz="4" w:space="0" w:color="E2E8F0"/>
+          <w:insideV w:val="single" w:sz="4" w:space="0" w:color="E2E8F0"/>
         </w:tblBorders>
+        <w:tblLook w:val="04A0" w:firstRow="1" w:lastRow="0" w:firstColumn="1" w:lastColumn="0" w:noHBand="0" w:noVBand="1"/>
       </w:tblPr>
       <w:tblGrid>
-        <w:gridCol w:w="3169"/>
-        <w:gridCol w:w="3169"/>
-        <w:gridCol w:w="3169"/>
+        <w:gridCol w:w="2860"/>
+        <w:gridCol w:w="3490"/>
+        <w:gridCol w:w="3140"/>
       </w:tblGrid>
       <w:tr>
         <w:tc>
           <w:tcPr>
-            <w:shd w:fill="F1F5F9" w:val="clear"/>
+            <w:tcW w:w="0" w:type="auto"/>
+            <w:shd w:val="clear" w:color="auto" w:fill="F1F5F9"/>
             <w:tcMar>
-              <w:top w:type="dxa" w:w="120"/>
-              <w:left w:type="dxa" w:w="160"/>
-              <w:bottom w:type="dxa" w:w="120"/>
-              <w:right w:type="dxa" w:w="160"/>
+              <w:top w:w="120" w:type="dxa"/>
+              <w:left w:w="160" w:type="dxa"/>
+              <w:bottom w:w="120" w:type="dxa"/>
+              <w:right w:w="160" w:type="dxa"/>
             </w:tcMar>
           </w:tcPr>
           <w:p>
@@ -87,24 +208,36 @@
                 <w:sz w:val="19"/>
                 <w:szCs w:val="19"/>
               </w:rPr>
-              <w:t xml:space="preserve">Total Casos</w:t>
+              <w:t>Total</w:t>
+            </w:r>
+            <w:r>
+              <w:rPr>
+                <w:b/>
+                <w:bCs/>
+                <w:color w:val="475569"/>
+                <w:sz w:val="19"/>
+                <w:szCs w:val="19"/>
+              </w:rPr>
+              <w:t xml:space="preserve"> Test</w:t>
             </w:r>
           </w:p>
         </w:tc>
         <w:tc>
           <w:tcPr>
-            <w:shd w:fill="ECFDF5" w:val="clear"/>
+            <w:tcW w:w="0" w:type="auto"/>
+            <w:shd w:val="clear" w:color="auto" w:fill="ECFDF5"/>
             <w:tcMar>
-              <w:top w:type="dxa" w:w="120"/>
-              <w:left w:type="dxa" w:w="160"/>
-              <w:bottom w:type="dxa" w:w="120"/>
-              <w:right w:type="dxa" w:w="160"/>
+              <w:top w:w="120" w:type="dxa"/>
+              <w:left w:w="160" w:type="dxa"/>
+              <w:bottom w:w="120" w:type="dxa"/>
+              <w:right w:w="160" w:type="dxa"/>
             </w:tcMar>
           </w:tcPr>
           <w:p>
             <w:pPr>
               <w:jc w:val="center"/>
             </w:pPr>
+            <w:proofErr w:type="spellStart"/>
             <w:r>
               <w:rPr>
                 <w:b/>
@@ -113,24 +246,27 @@
                 <w:sz w:val="19"/>
                 <w:szCs w:val="19"/>
               </w:rPr>
-              <w:t xml:space="preserve">Exitosos (Passed)</w:t>
+              <w:t>Passed</w:t>
             </w:r>
+            <w:proofErr w:type="spellEnd"/>
           </w:p>
         </w:tc>
         <w:tc>
           <w:tcPr>
-            <w:shd w:fill="FEF2F2" w:val="clear"/>
+            <w:tcW w:w="0" w:type="auto"/>
+            <w:shd w:val="clear" w:color="auto" w:fill="FEF2F2"/>
             <w:tcMar>
-              <w:top w:type="dxa" w:w="120"/>
-              <w:left w:type="dxa" w:w="160"/>
-              <w:bottom w:type="dxa" w:w="120"/>
-              <w:right w:type="dxa" w:w="160"/>
+              <w:top w:w="120" w:type="dxa"/>
+              <w:left w:w="160" w:type="dxa"/>
+              <w:bottom w:w="120" w:type="dxa"/>
+              <w:right w:w="160" w:type="dxa"/>
             </w:tcMar>
           </w:tcPr>
           <w:p>
             <w:pPr>
               <w:jc w:val="center"/>
             </w:pPr>
+            <w:proofErr w:type="spellStart"/>
             <w:r>
               <w:rPr>
                 <w:b/>
@@ -139,20 +275,22 @@
                 <w:sz w:val="19"/>
                 <w:szCs w:val="19"/>
               </w:rPr>
-              <w:t xml:space="preserve">Fallidos (Failed)</w:t>
+              <w:t>Failed</w:t>
             </w:r>
+            <w:proofErr w:type="spellEnd"/>
           </w:p>
         </w:tc>
       </w:tr>
       <w:tr>
         <w:tc>
           <w:tcPr>
-            <w:shd w:fill="FFFFFF" w:val="clear"/>
+            <w:tcW w:w="0" w:type="auto"/>
+            <w:shd w:val="clear" w:color="auto" w:fill="FFFFFF"/>
             <w:tcMar>
-              <w:top w:type="dxa" w:w="140"/>
-              <w:left w:type="dxa" w:w="160"/>
-              <w:bottom w:type="dxa" w:w="140"/>
-              <w:right w:type="dxa" w:w="160"/>
+              <w:top w:w="140" w:type="dxa"/>
+              <w:left w:w="160" w:type="dxa"/>
+              <w:bottom w:w="140" w:type="dxa"/>
+              <w:right w:w="160" w:type="dxa"/>
             </w:tcMar>
           </w:tcPr>
           <w:p>
@@ -167,18 +305,19 @@
                 <w:sz w:val="34"/>
                 <w:szCs w:val="34"/>
               </w:rPr>
-              <w:t xml:space="preserve">${total}</w:t>
+              <w:t>${total}</w:t>
             </w:r>
           </w:p>
         </w:tc>
         <w:tc>
           <w:tcPr>
-            <w:shd w:fill="FFFFFF" w:val="clear"/>
+            <w:tcW w:w="0" w:type="auto"/>
+            <w:shd w:val="clear" w:color="auto" w:fill="FFFFFF"/>
             <w:tcMar>
-              <w:top w:type="dxa" w:w="140"/>
-              <w:left w:type="dxa" w:w="160"/>
-              <w:bottom w:type="dxa" w:w="140"/>
-              <w:right w:type="dxa" w:w="160"/>
+              <w:top w:w="140" w:type="dxa"/>
+              <w:left w:w="160" w:type="dxa"/>
+              <w:bottom w:w="140" w:type="dxa"/>
+              <w:right w:w="160" w:type="dxa"/>
             </w:tcMar>
           </w:tcPr>
           <w:p>
@@ -193,18 +332,41 @@
                 <w:sz w:val="34"/>
                 <w:szCs w:val="34"/>
               </w:rPr>
-              <w:t xml:space="preserve">${passed}</w:t>
+              <w:t>${</w:t>
+            </w:r>
+            <w:proofErr w:type="spellStart"/>
+            <w:r>
+              <w:rPr>
+                <w:b/>
+                <w:bCs/>
+                <w:color w:val="16A34A"/>
+                <w:sz w:val="34"/>
+                <w:szCs w:val="34"/>
+              </w:rPr>
+              <w:t>passed</w:t>
+            </w:r>
+            <w:proofErr w:type="spellEnd"/>
+            <w:r>
+              <w:rPr>
+                <w:b/>
+                <w:bCs/>
+                <w:color w:val="16A34A"/>
+                <w:sz w:val="34"/>
+                <w:szCs w:val="34"/>
+              </w:rPr>
+              <w:t>}</w:t>
             </w:r>
           </w:p>
         </w:tc>
         <w:tc>
           <w:tcPr>
-            <w:shd w:fill="FFFFFF" w:val="clear"/>
+            <w:tcW w:w="0" w:type="auto"/>
+            <w:shd w:val="clear" w:color="auto" w:fill="FFFFFF"/>
             <w:tcMar>
-              <w:top w:type="dxa" w:w="140"/>
-              <w:left w:type="dxa" w:w="160"/>
-              <w:bottom w:type="dxa" w:w="140"/>
-              <w:right w:type="dxa" w:w="160"/>
+              <w:top w:w="140" w:type="dxa"/>
+              <w:left w:w="160" w:type="dxa"/>
+              <w:bottom w:w="140" w:type="dxa"/>
+              <w:right w:w="160" w:type="dxa"/>
             </w:tcMar>
           </w:tcPr>
           <w:p>
@@ -219,7 +381,29 @@
                 <w:sz w:val="34"/>
                 <w:szCs w:val="34"/>
               </w:rPr>
-              <w:t xml:space="preserve">${failed}</w:t>
+              <w:t>${</w:t>
+            </w:r>
+            <w:proofErr w:type="spellStart"/>
+            <w:r>
+              <w:rPr>
+                <w:b/>
+                <w:bCs/>
+                <w:color w:val="DC2626"/>
+                <w:sz w:val="34"/>
+                <w:szCs w:val="34"/>
+              </w:rPr>
+              <w:t>failed</w:t>
+            </w:r>
+            <w:proofErr w:type="spellEnd"/>
+            <w:r>
+              <w:rPr>
+                <w:b/>
+                <w:bCs/>
+                <w:color w:val="DC2626"/>
+                <w:sz w:val="34"/>
+                <w:szCs w:val="34"/>
+              </w:rPr>
+              <w:t>}</w:t>
             </w:r>
           </w:p>
         </w:tc>
@@ -227,7 +411,7 @@
     </w:tbl>
     <w:p>
       <w:pPr>
-        <w:spacing w:after="120" w:before="400"/>
+        <w:spacing w:before="400" w:after="120"/>
       </w:pPr>
       <w:r>
         <w:rPr>
@@ -237,20 +421,155 @@
           <w:sz w:val="24"/>
           <w:szCs w:val="24"/>
         </w:rPr>
-        <w:t xml:space="preserve">Detalle de Casos de Prueba</w:t>
-      </w:r>
+        <w:t xml:space="preserve">Test Case </w:t>
+      </w:r>
+      <w:proofErr w:type="spellStart"/>
+      <w:r>
+        <w:rPr>
+          <w:b/>
+          <w:bCs/>
+          <w:color w:val="1E293B"/>
+          <w:sz w:val="24"/>
+          <w:szCs w:val="24"/>
+        </w:rPr>
+        <w:t>Details</w:t>
+      </w:r>
+      <w:proofErr w:type="spellEnd"/>
     </w:p>
     <w:p>
       <w:pPr>
-        <w:spacing w:after="200"/>
-      </w:pPr>
-      <w:r>
+        <w:spacing w:after="240"/>
         <w:rPr>
           <w:color w:val="64748B"/>
           <w:sz w:val="19"/>
           <w:szCs w:val="19"/>
         </w:rPr>
-        <w:t xml:space="preserve">Tabla consolidada con el detalle de ejecución para cada caso evaluado:</w:t>
+      </w:pPr>
+      <w:proofErr w:type="spellStart"/>
+      <w:r>
+        <w:rPr>
+          <w:color w:val="64748B"/>
+          <w:sz w:val="19"/>
+          <w:szCs w:val="19"/>
+        </w:rPr>
+        <w:t>Consolidated</w:t>
+      </w:r>
+      <w:proofErr w:type="spellEnd"/>
+      <w:r>
+        <w:rPr>
+          <w:color w:val="64748B"/>
+          <w:sz w:val="19"/>
+          <w:szCs w:val="19"/>
+        </w:rPr>
+        <w:t xml:space="preserve"> table </w:t>
+      </w:r>
+      <w:proofErr w:type="spellStart"/>
+      <w:r>
+        <w:rPr>
+          <w:color w:val="64748B"/>
+          <w:sz w:val="19"/>
+          <w:szCs w:val="19"/>
+        </w:rPr>
+        <w:t>with</w:t>
+      </w:r>
+      <w:proofErr w:type="spellEnd"/>
+      <w:r>
+        <w:rPr>
+          <w:color w:val="64748B"/>
+          <w:sz w:val="19"/>
+          <w:szCs w:val="19"/>
+        </w:rPr>
+        <w:t xml:space="preserve"> </w:t>
+      </w:r>
+      <w:proofErr w:type="spellStart"/>
+      <w:r>
+        <w:rPr>
+          <w:color w:val="64748B"/>
+          <w:sz w:val="19"/>
+          <w:szCs w:val="19"/>
+        </w:rPr>
+        <w:t>execution</w:t>
+      </w:r>
+      <w:proofErr w:type="spellEnd"/>
+      <w:r>
+        <w:rPr>
+          <w:color w:val="64748B"/>
+          <w:sz w:val="19"/>
+          <w:szCs w:val="19"/>
+        </w:rPr>
+        <w:t xml:space="preserve"> </w:t>
+      </w:r>
+      <w:proofErr w:type="spellStart"/>
+      <w:r>
+        <w:rPr>
+          <w:color w:val="64748B"/>
+          <w:sz w:val="19"/>
+          <w:szCs w:val="19"/>
+        </w:rPr>
+        <w:t>details</w:t>
+      </w:r>
+      <w:proofErr w:type="spellEnd"/>
+      <w:r>
+        <w:rPr>
+          <w:color w:val="64748B"/>
+          <w:sz w:val="19"/>
+          <w:szCs w:val="19"/>
+        </w:rPr>
+        <w:t xml:space="preserve"> </w:t>
+      </w:r>
+      <w:proofErr w:type="spellStart"/>
+      <w:r>
+        <w:rPr>
+          <w:color w:val="64748B"/>
+          <w:sz w:val="19"/>
+          <w:szCs w:val="19"/>
+        </w:rPr>
+        <w:t>for</w:t>
+      </w:r>
+      <w:proofErr w:type="spellEnd"/>
+      <w:r>
+        <w:rPr>
+          <w:color w:val="64748B"/>
+          <w:sz w:val="19"/>
+          <w:szCs w:val="19"/>
+        </w:rPr>
+        <w:t xml:space="preserve"> </w:t>
+      </w:r>
+      <w:proofErr w:type="spellStart"/>
+      <w:r>
+        <w:rPr>
+          <w:color w:val="64748B"/>
+          <w:sz w:val="19"/>
+          <w:szCs w:val="19"/>
+        </w:rPr>
+        <w:t>each</w:t>
+      </w:r>
+      <w:proofErr w:type="spellEnd"/>
+      <w:r>
+        <w:rPr>
+          <w:color w:val="64748B"/>
+          <w:sz w:val="19"/>
+          <w:szCs w:val="19"/>
+        </w:rPr>
+        <w:t xml:space="preserve"> case </w:t>
+      </w:r>
+      <w:proofErr w:type="spellStart"/>
+      <w:r>
+        <w:rPr>
+          <w:color w:val="64748B"/>
+          <w:sz w:val="19"/>
+          <w:szCs w:val="19"/>
+        </w:rPr>
+        <w:t>evaluated</w:t>
+      </w:r>
+      <w:proofErr w:type="spellEnd"/>
+      <w:r>
+        <w:rPr>
+          <w:color w:val="64748B"/>
+          <w:sz w:val="19"/>
+          <w:szCs w:val="19"/>
+        </w:rPr>
+        <w:t>:</w:t>
       </w:r>
     </w:p>
     <w:p>
@@ -258,15 +577,15 @@
         <w:spacing w:after="240"/>
       </w:pPr>
       <w:r>
-        <w:t xml:space="preserve">${table}</w:t>
+        <w:t>${table}</w:t>
       </w:r>
     </w:p>
     <w:sectPr>
-      <w:headerReference w:type="default" r:id="rId6"/>
-      <w:footerReference w:type="default" r:id="rId7"/>
-      <w:pgSz w:w="11906" w:h="16838" w:orient="portrait"/>
+      <w:headerReference w:type="default" r:id="rId7"/>
+      <w:footerReference w:type="default" r:id="rId8"/>
+      <w:pgSz w:w="11906" w:h="16838"/>
       <w:pgMar w:top="1000" w:right="1200" w:bottom="1000" w:left="1200" w:header="708" w:footer="708" w:gutter="0"/>
-      <w:pgNumType/>
+      <w:cols w:space="720"/>
       <w:docGrid w:linePitch="360"/>
     </w:sectPr>
   </w:body>
@@ -274,18 +593,9 @@
 </file>
 
 <file path=word/endnotes.xml><?xml version="1.0" encoding="utf-8"?>
-<w:endnotes xmlns:wpc="http://schemas.microsoft.com/office/word/2010/wordprocessingCanvas" xmlns:mc="http://schemas.openxmlformats.org/markup-compatibility/2006" xmlns:o="urn:schemas-microsoft-com:office:office" xmlns:r="http://schemas.openxmlformats.org/officeDocument/2006/relationships" xmlns:m="http://schemas.openxmlformats.org/officeDocument/2006/math" xmlns:v="urn:schemas-microsoft-com:vml" xmlns:wp14="http://schemas.microsoft.com/office/word/2010/wordprocessingDrawing" xmlns:wp="http://schemas.openxmlformats.org/drawingml/2006/wordprocessingDrawing" xmlns:w10="urn:schemas-microsoft-com:office:word" xmlns:w="http://schemas.openxmlformats.org/wordprocessingml/2006/main" xmlns:w14="http://schemas.microsoft.com/office/word/2010/wordml" xmlns:w15="http://schemas.microsoft.com/office/word/2012/wordml" xmlns:wpg="http://schemas.microsoft.com/office/word/2010/wordprocessingGroup" xmlns:wpi="http://schemas.microsoft.com/office/word/2010/wordprocessingInk" xmlns:wne="http://schemas.microsoft.com/office/word/2006/wordml" xmlns:wps="http://schemas.microsoft.com/office/word/2010/wordprocessingShape" mc:Ignorable="w14 w15 wp14">
+<w:endnotes xmlns:wpc="http://schemas.microsoft.com/office/word/2010/wordprocessingCanvas" xmlns:cx="http://schemas.microsoft.com/office/drawing/2014/chartex" xmlns:cx1="http://schemas.microsoft.com/office/drawing/2015/9/8/chartex" xmlns:cx2="http://schemas.microsoft.com/office/drawing/2015/10/21/chartex" xmlns:cx3="http://schemas.microsoft.com/office/drawing/2016/5/9/chartex" xmlns:cx4="http://schemas.microsoft.com/office/drawing/2016/5/10/chartex" xmlns:cx5="http://schemas.microsoft.com/office/drawing/2016/5/11/chartex" xmlns:cx6="http://schemas.microsoft.com/office/drawing/2016/5/12/chartex" xmlns:cx7="http://schemas.microsoft.com/office/drawing/2016/5/13/chartex" xmlns:cx8="http://schemas.microsoft.com/office/drawing/2016/5/14/chartex" xmlns:mc="http://schemas.openxmlformats.org/markup-compatibility/2006" xmlns:aink="http://schemas.microsoft.com/office/drawing/2016/ink" xmlns:am3d="http://schemas.microsoft.com/office/drawing/2017/model3d" xmlns:o="urn:schemas-microsoft-com:office:office" xmlns:oel="http://schemas.microsoft.com/office/2019/extlst" xmlns:r="http://schemas.openxmlformats.org/officeDocument/2006/relationships" xmlns:m="http://schemas.openxmlformats.org/officeDocument/2006/math" xmlns:v="urn:schemas-microsoft-com:vml" xmlns:wp14="http://schemas.microsoft.com/office/word/2010/wordprocessingDrawing" xmlns:wp="http://schemas.openxmlformats.org/drawingml/2006/wordprocessingDrawing" xmlns:w10="urn:schemas-microsoft-com:office:word" xmlns:w="http://schemas.openxmlformats.org/wordprocessingml/2006/main" xmlns:w14="http://schemas.microsoft.com/office/word/2010/wordml" xmlns:w15="http://schemas.microsoft.com/office/word/2012/wordml" xmlns:w16cex="http://schemas.microsoft.com/office/word/2018/wordml/cex" xmlns:w16cid="http://schemas.microsoft.com/office/word/2016/wordml/cid" xmlns:w16="http://schemas.microsoft.com/office/word/2018/wordml" xmlns:w16du="http://schemas.microsoft.com/office/word/2023/wordml/word16du" xmlns:w16sdtdh="http://schemas.microsoft.com/office/word/2020/wordml/sdtdatahash" xmlns:w16sdtfl="http://schemas.microsoft.com/office/word/2024/wordml/sdtformatlock" xmlns:w16se="http://schemas.microsoft.com/office/word/2015/wordml/symex" xmlns:wpg="http://schemas.microsoft.com/office/word/2010/wordprocessingGroup" xmlns:wpi="http://schemas.microsoft.com/office/word/2010/wordprocessingInk" xmlns:wne="http://schemas.microsoft.com/office/word/2006/wordml" xmlns:wps="http://schemas.microsoft.com/office/word/2010/wordprocessingShape" mc:Ignorable="w14 w15 w16se w16cid w16 w16cex w16sdtdh w16sdtfl w16du wp14">
   <w:endnote w:type="separator" w:id="-1">
     <w:p>
-      <w:pPr>
-        <w:spacing w:after="0" w:line="240" w:lineRule="auto"/>
-      </w:pPr>
-      <w:r>
-        <w:rPr>
-          <w:rStyle w:val="EndnoteReference"/>
-        </w:rPr>
-        <w:endnoteRef/>
-      </w:r>
       <w:r>
         <w:separator/>
       </w:r>
@@ -293,15 +603,6 @@
   </w:endnote>
   <w:endnote w:type="continuationSeparator" w:id="0">
     <w:p>
-      <w:pPr>
-        <w:spacing w:after="0" w:line="240" w:lineRule="auto"/>
-      </w:pPr>
-      <w:r>
-        <w:rPr>
-          <w:rStyle w:val="EndnoteReference"/>
-        </w:rPr>
-        <w:endnoteRef/>
-      </w:r>
       <w:r>
         <w:continuationSeparator/>
       </w:r>
@@ -311,18 +612,14 @@
 </file>
 
 <file path=word/footer1.xml><?xml version="1.0" encoding="utf-8"?>
-<w:ftr xmlns:wpc="http://schemas.microsoft.com/office/word/2010/wordprocessingCanvas" xmlns:mc="http://schemas.openxmlformats.org/markup-compatibility/2006" xmlns:o="urn:schemas-microsoft-com:office:office" xmlns:r="http://schemas.openxmlformats.org/officeDocument/2006/relationships" xmlns:m="http://schemas.openxmlformats.org/officeDocument/2006/math" xmlns:v="urn:schemas-microsoft-com:vml" xmlns:wp14="http://schemas.microsoft.com/office/word/2010/wordprocessingDrawing" xmlns:wp="http://schemas.openxmlformats.org/drawingml/2006/wordprocessingDrawing" xmlns:w10="urn:schemas-microsoft-com:office:word" xmlns:w="http://schemas.openxmlformats.org/wordprocessingml/2006/main" xmlns:w14="http://schemas.microsoft.com/office/word/2010/wordml" xmlns:w15="http://schemas.microsoft.com/office/word/2012/wordml" xmlns:wpg="http://schemas.microsoft.com/office/word/2010/wordprocessingGroup" xmlns:wpi="http://schemas.microsoft.com/office/word/2010/wordprocessingInk" xmlns:wne="http://schemas.microsoft.com/office/word/2006/wordml" xmlns:wps="http://schemas.microsoft.com/office/word/2010/wordprocessingShape">
+<w:ftr xmlns:wpc="http://schemas.microsoft.com/office/word/2010/wordprocessingCanvas" xmlns:cx="http://schemas.microsoft.com/office/drawing/2014/chartex" xmlns:cx1="http://schemas.microsoft.com/office/drawing/2015/9/8/chartex" xmlns:cx2="http://schemas.microsoft.com/office/drawing/2015/10/21/chartex" xmlns:cx3="http://schemas.microsoft.com/office/drawing/2016/5/9/chartex" xmlns:cx4="http://schemas.microsoft.com/office/drawing/2016/5/10/chartex" xmlns:cx5="http://schemas.microsoft.com/office/drawing/2016/5/11/chartex" xmlns:cx6="http://schemas.microsoft.com/office/drawing/2016/5/12/chartex" xmlns:cx7="http://schemas.microsoft.com/office/drawing/2016/5/13/chartex" xmlns:cx8="http://schemas.microsoft.com/office/drawing/2016/5/14/chartex" xmlns:mc="http://schemas.openxmlformats.org/markup-compatibility/2006" xmlns:aink="http://schemas.microsoft.com/office/drawing/2016/ink" xmlns:am3d="http://schemas.microsoft.com/office/drawing/2017/model3d" xmlns:o="urn:schemas-microsoft-com:office:office" xmlns:oel="http://schemas.microsoft.com/office/2019/extlst" xmlns:r="http://schemas.openxmlformats.org/officeDocument/2006/relationships" xmlns:m="http://schemas.openxmlformats.org/officeDocument/2006/math" xmlns:v="urn:schemas-microsoft-com:vml" xmlns:wp14="http://schemas.microsoft.com/office/word/2010/wordprocessingDrawing" xmlns:wp="http://schemas.openxmlformats.org/drawingml/2006/wordprocessingDrawing" xmlns:w10="urn:schemas-microsoft-com:office:word" xmlns:w="http://schemas.openxmlformats.org/wordprocessingml/2006/main" xmlns:w14="http://schemas.microsoft.com/office/word/2010/wordml" xmlns:w15="http://schemas.microsoft.com/office/word/2012/wordml" xmlns:w16cex="http://schemas.microsoft.com/office/word/2018/wordml/cex" xmlns:w16cid="http://schemas.microsoft.com/office/word/2016/wordml/cid" xmlns:w16="http://schemas.microsoft.com/office/word/2018/wordml" xmlns:w16du="http://schemas.microsoft.com/office/word/2023/wordml/word16du" xmlns:w16sdtdh="http://schemas.microsoft.com/office/word/2020/wordml/sdtdatahash" xmlns:w16sdtfl="http://schemas.microsoft.com/office/word/2024/wordml/sdtformatlock" xmlns:w16se="http://schemas.microsoft.com/office/word/2015/wordml/symex" xmlns:wpg="http://schemas.microsoft.com/office/word/2010/wordprocessingGroup" xmlns:wpi="http://schemas.microsoft.com/office/word/2010/wordprocessingInk" xmlns:wne="http://schemas.microsoft.com/office/word/2006/wordml" xmlns:wps="http://schemas.microsoft.com/office/word/2010/wordprocessingShape" mc:Ignorable="w14 w15 w16se w16cid w16 w16cex w16sdtdh w16sdtfl w16du wp14">
   <w:tbl>
     <w:tblPr>
-      <w:tblW w:type="pct" w:w="5000"/>
+      <w:tblW w:w="5000" w:type="pct"/>
       <w:tblBorders>
-        <w:top w:val="single" w:color="E2E8F0" w:sz="4"/>
-        <w:left w:val="none"/>
-        <w:bottom w:val="none"/>
-        <w:right w:val="none"/>
-        <w:insideH w:val="none"/>
-        <w:insideV w:val="none"/>
+        <w:top w:val="single" w:sz="4" w:space="0" w:color="E2E8F0"/>
       </w:tblBorders>
+      <w:tblLook w:val="04A0" w:firstRow="1" w:lastRow="0" w:firstColumn="1" w:lastColumn="0" w:noHBand="0" w:noVBand="1"/>
     </w:tblPr>
     <w:tblGrid>
       <w:gridCol w:w="6179"/>
@@ -331,7 +628,7 @@
     <w:tr>
       <w:tc>
         <w:tcPr>
-          <w:tcW w:type="pct" w:w="3250"/>
+          <w:tcW w:w="3250" w:type="pct"/>
         </w:tcPr>
         <w:p>
           <w:r>
@@ -340,13 +637,49 @@
               <w:sz w:val="16"/>
               <w:szCs w:val="16"/>
             </w:rPr>
-            <w:t xml:space="preserve">Generado automáticamente por testform • Plataforma Test as Code (TaC)</w:t>
+            <w:t xml:space="preserve">Generado automáticamente por </w:t>
+          </w:r>
+          <w:proofErr w:type="spellStart"/>
+          <w:r>
+            <w:rPr>
+              <w:color w:val="94A3B8"/>
+              <w:sz w:val="16"/>
+              <w:szCs w:val="16"/>
+            </w:rPr>
+            <w:t>testform</w:t>
+          </w:r>
+          <w:proofErr w:type="spellEnd"/>
+          <w:r>
+            <w:rPr>
+              <w:color w:val="94A3B8"/>
+              <w:sz w:val="16"/>
+              <w:szCs w:val="16"/>
+            </w:rPr>
+            <w:t xml:space="preserve"> • Plataforma Test as Code (</w:t>
+          </w:r>
+          <w:proofErr w:type="spellStart"/>
+          <w:r>
+            <w:rPr>
+              <w:color w:val="94A3B8"/>
+              <w:sz w:val="16"/>
+              <w:szCs w:val="16"/>
+            </w:rPr>
+            <w:t>TaC</w:t>
+          </w:r>
+          <w:proofErr w:type="spellEnd"/>
+          <w:r>
+            <w:rPr>
+              <w:color w:val="94A3B8"/>
+              <w:sz w:val="16"/>
+              <w:szCs w:val="16"/>
+            </w:rPr>
+            <w:t>)</w:t>
           </w:r>
         </w:p>
       </w:tc>
       <w:tc>
         <w:tcPr>
-          <w:tcW w:type="pct" w:w="1750"/>
+          <w:tcW w:w="1750" w:type="pct"/>
         </w:tcPr>
         <w:p>
           <w:pPr>
@@ -358,7 +691,7 @@
               <w:sz w:val="16"/>
               <w:szCs w:val="16"/>
             </w:rPr>
-            <w:t xml:space="preserve">https://github.com/fromeroc9/testform</w:t>
+            <w:t>https://github.com/fromeroc9/testform</w:t>
           </w:r>
         </w:p>
       </w:tc>
@@ -368,18 +701,9 @@
 </file>
 
 <file path=word/footnotes.xml><?xml version="1.0" encoding="utf-8"?>
-<w:footnotes xmlns:wpc="http://schemas.microsoft.com/office/word/2010/wordprocessingCanvas" xmlns:mc="http://schemas.openxmlformats.org/markup-compatibility/2006" xmlns:o="urn:schemas-microsoft-com:office:office" xmlns:r="http://schemas.openxmlformats.org/officeDocument/2006/relationships" xmlns:m="http://schemas.openxmlformats.org/officeDocument/2006/math" xmlns:v="urn:schemas-microsoft-com:vml" xmlns:wp14="http://schemas.microsoft.com/office/word/2010/wordprocessingDrawing" xmlns:wp="http://schemas.openxmlformats.org/drawingml/2006/wordprocessingDrawing" xmlns:w10="urn:schemas-microsoft-com:office:word" xmlns:w="http://schemas.openxmlformats.org/wordprocessingml/2006/main" xmlns:w14="http://schemas.microsoft.com/office/word/2010/wordml" xmlns:w15="http://schemas.microsoft.com/office/word/2012/wordml" xmlns:wpg="http://schemas.microsoft.com/office/word/2010/wordprocessingGroup" xmlns:wpi="http://schemas.microsoft.com/office/word/2010/wordprocessingInk" xmlns:wne="http://schemas.microsoft.com/office/word/2006/wordml" xmlns:wps="http://schemas.microsoft.com/office/word/2010/wordprocessingShape" mc:Ignorable="w14 w15 wp14">
+<w:footnotes xmlns:wpc="http://schemas.microsoft.com/office/word/2010/wordprocessingCanvas" xmlns:cx="http://schemas.microsoft.com/office/drawing/2014/chartex" xmlns:cx1="http://schemas.microsoft.com/office/drawing/2015/9/8/chartex" xmlns:cx2="http://schemas.microsoft.com/office/drawing/2015/10/21/chartex" xmlns:cx3="http://schemas.microsoft.com/office/drawing/2016/5/9/chartex" xmlns:cx4="http://schemas.microsoft.com/office/drawing/2016/5/10/chartex" xmlns:cx5="http://schemas.microsoft.com/office/drawing/2016/5/11/chartex" xmlns:cx6="http://schemas.microsoft.com/office/drawing/2016/5/12/chartex" xmlns:cx7="http://schemas.microsoft.com/office/drawing/2016/5/13/chartex" xmlns:cx8="http://schemas.microsoft.com/office/drawing/2016/5/14/chartex" xmlns:mc="http://schemas.openxmlformats.org/markup-compatibility/2006" xmlns:aink="http://schemas.microsoft.com/office/drawing/2016/ink" xmlns:am3d="http://schemas.microsoft.com/office/drawing/2017/model3d" xmlns:o="urn:schemas-microsoft-com:office:office" xmlns:oel="http://schemas.microsoft.com/office/2019/extlst" xmlns:r="http://schemas.openxmlformats.org/officeDocument/2006/relationships" xmlns:m="http://schemas.openxmlformats.org/officeDocument/2006/math" xmlns:v="urn:schemas-microsoft-com:vml" xmlns:wp14="http://schemas.microsoft.com/office/word/2010/wordprocessingDrawing" xmlns:wp="http://schemas.openxmlformats.org/drawingml/2006/wordprocessingDrawing" xmlns:w10="urn:schemas-microsoft-com:office:word" xmlns:w="http://schemas.openxmlformats.org/wordprocessingml/2006/main" xmlns:w14="http://schemas.microsoft.com/office/word/2010/wordml" xmlns:w15="http://schemas.microsoft.com/office/word/2012/wordml" xmlns:w16cex="http://schemas.microsoft.com/office/word/2018/wordml/cex" xmlns:w16cid="http://schemas.microsoft.com/office/word/2016/wordml/cid" xmlns:w16="http://schemas.microsoft.com/office/word/2018/wordml" xmlns:w16du="http://schemas.microsoft.com/office/word/2023/wordml/word16du" xmlns:w16sdtdh="http://schemas.microsoft.com/office/word/2020/wordml/sdtdatahash" xmlns:w16sdtfl="http://schemas.microsoft.com/office/word/2024/wordml/sdtformatlock" xmlns:w16se="http://schemas.microsoft.com/office/word/2015/wordml/symex" xmlns:wpg="http://schemas.microsoft.com/office/word/2010/wordprocessingGroup" xmlns:wpi="http://schemas.microsoft.com/office/word/2010/wordprocessingInk" xmlns:wne="http://schemas.microsoft.com/office/word/2006/wordml" xmlns:wps="http://schemas.microsoft.com/office/word/2010/wordprocessingShape" mc:Ignorable="w14 w15 w16se w16cid w16 w16cex w16sdtdh w16sdtfl w16du wp14">
   <w:footnote w:type="separator" w:id="-1">
     <w:p>
-      <w:pPr>
-        <w:spacing w:after="0" w:line="240" w:lineRule="auto"/>
-      </w:pPr>
-      <w:r>
-        <w:rPr>
-          <w:rStyle w:val="FootnoteReference"/>
-        </w:rPr>
-        <w:footnoteRef/>
-      </w:r>
       <w:r>
         <w:separator/>
       </w:r>
@@ -387,15 +711,6 @@
   </w:footnote>
   <w:footnote w:type="continuationSeparator" w:id="0">
     <w:p>
-      <w:pPr>
-        <w:spacing w:after="0" w:line="240" w:lineRule="auto"/>
-      </w:pPr>
-      <w:r>
-        <w:rPr>
-          <w:rStyle w:val="FootnoteReference"/>
-        </w:rPr>
-        <w:footnoteRef/>
-      </w:r>
       <w:r>
         <w:continuationSeparator/>
       </w:r>
@@ -405,18 +720,11 @@
 </file>
 
 <file path=word/header1.xml><?xml version="1.0" encoding="utf-8"?>
-<w:hdr xmlns:wpc="http://schemas.microsoft.com/office/word/2010/wordprocessingCanvas" xmlns:mc="http://schemas.openxmlformats.org/markup-compatibility/2006" xmlns:o="urn:schemas-microsoft-com:office:office" xmlns:r="http://schemas.openxmlformats.org/officeDocument/2006/relationships" xmlns:m="http://schemas.openxmlformats.org/officeDocument/2006/math" xmlns:v="urn:schemas-microsoft-com:vml" xmlns:wp14="http://schemas.microsoft.com/office/word/2010/wordprocessingDrawing" xmlns:wp="http://schemas.openxmlformats.org/drawingml/2006/wordprocessingDrawing" xmlns:w10="urn:schemas-microsoft-com:office:word" xmlns:w="http://schemas.openxmlformats.org/wordprocessingml/2006/main" xmlns:w14="http://schemas.microsoft.com/office/word/2010/wordml" xmlns:w15="http://schemas.microsoft.com/office/word/2012/wordml" xmlns:wpg="http://schemas.microsoft.com/office/word/2010/wordprocessingGroup" xmlns:wpi="http://schemas.microsoft.com/office/word/2010/wordprocessingInk" xmlns:wne="http://schemas.microsoft.com/office/word/2006/wordml" xmlns:wps="http://schemas.microsoft.com/office/word/2010/wordprocessingShape" xmlns:cx="http://schemas.microsoft.com/office/drawing/2014/chartex" xmlns:cx1="http://schemas.microsoft.com/office/drawing/2015/9/8/chartex" xmlns:cx2="http://schemas.microsoft.com/office/drawing/2015/10/21/chartex" xmlns:cx3="http://schemas.microsoft.com/office/drawing/2016/5/9/chartex" xmlns:cx4="http://schemas.microsoft.com/office/drawing/2016/5/10/chartex" xmlns:cx5="http://schemas.microsoft.com/office/drawing/2016/5/11/chartex" xmlns:cx6="http://schemas.microsoft.com/office/drawing/2016/5/12/chartex" xmlns:cx7="http://schemas.microsoft.com/office/drawing/2016/5/13/chartex" xmlns:cx8="http://schemas.microsoft.com/office/drawing/2016/5/14/chartex" xmlns:w16cid="http://schemas.microsoft.com/office/word/2016/wordml/cid" xmlns:w16se="http://schemas.microsoft.com/office/word/2015/wordml/symex">
+<w:hdr xmlns:wpc="http://schemas.microsoft.com/office/word/2010/wordprocessingCanvas" xmlns:cx="http://schemas.microsoft.com/office/drawing/2014/chartex" xmlns:cx1="http://schemas.microsoft.com/office/drawing/2015/9/8/chartex" xmlns:cx2="http://schemas.microsoft.com/office/drawing/2015/10/21/chartex" xmlns:cx3="http://schemas.microsoft.com/office/drawing/2016/5/9/chartex" xmlns:cx4="http://schemas.microsoft.com/office/drawing/2016/5/10/chartex" xmlns:cx5="http://schemas.microsoft.com/office/drawing/2016/5/11/chartex" xmlns:cx6="http://schemas.microsoft.com/office/drawing/2016/5/12/chartex" xmlns:cx7="http://schemas.microsoft.com/office/drawing/2016/5/13/chartex" xmlns:cx8="http://schemas.microsoft.com/office/drawing/2016/5/14/chartex" xmlns:mc="http://schemas.openxmlformats.org/markup-compatibility/2006" xmlns:aink="http://schemas.microsoft.com/office/drawing/2016/ink" xmlns:am3d="http://schemas.microsoft.com/office/drawing/2017/model3d" xmlns:o="urn:schemas-microsoft-com:office:office" xmlns:oel="http://schemas.microsoft.com/office/2019/extlst" xmlns:r="http://schemas.openxmlformats.org/officeDocument/2006/relationships" xmlns:m="http://schemas.openxmlformats.org/officeDocument/2006/math" xmlns:v="urn:schemas-microsoft-com:vml" xmlns:wp14="http://schemas.microsoft.com/office/word/2010/wordprocessingDrawing" xmlns:wp="http://schemas.openxmlformats.org/drawingml/2006/wordprocessingDrawing" xmlns:w10="urn:schemas-microsoft-com:office:word" xmlns:w="http://schemas.openxmlformats.org/wordprocessingml/2006/main" xmlns:w14="http://schemas.microsoft.com/office/word/2010/wordml" xmlns:w15="http://schemas.microsoft.com/office/word/2012/wordml" xmlns:w16cex="http://schemas.microsoft.com/office/word/2018/wordml/cex" xmlns:w16cid="http://schemas.microsoft.com/office/word/2016/wordml/cid" xmlns:w16="http://schemas.microsoft.com/office/word/2018/wordml" xmlns:w16du="http://schemas.microsoft.com/office/word/2023/wordml/word16du" xmlns:w16sdtdh="http://schemas.microsoft.com/office/word/2020/wordml/sdtdatahash" xmlns:w16sdtfl="http://schemas.microsoft.com/office/word/2024/wordml/sdtformatlock" xmlns:w16se="http://schemas.microsoft.com/office/word/2015/wordml/symex" xmlns:wpg="http://schemas.microsoft.com/office/word/2010/wordprocessingGroup" xmlns:wpi="http://schemas.microsoft.com/office/word/2010/wordprocessingInk" xmlns:wne="http://schemas.microsoft.com/office/word/2006/wordml" xmlns:wps="http://schemas.microsoft.com/office/word/2010/wordprocessingShape" mc:Ignorable="w14 w15 w16se w16cid w16 w16cex w16sdtdh w16sdtfl w16du wp14">
   <w:tbl>
     <w:tblPr>
-      <w:tblW w:type="pct" w:w="5000"/>
-      <w:tblBorders>
-        <w:top w:val="none"/>
-        <w:left w:val="none"/>
-        <w:bottom w:val="single" w:color="0284C7" w:sz="8"/>
-        <w:right w:val="none"/>
-        <w:insideH w:val="none"/>
-        <w:insideV w:val="none"/>
-      </w:tblBorders>
+      <w:tblW w:w="5000" w:type="pct"/>
+      <w:tblLook w:val="04A0" w:firstRow="1" w:lastRow="0" w:firstColumn="1" w:lastColumn="0" w:noHBand="0" w:noVBand="1"/>
     </w:tblPr>
     <w:tblGrid>
       <w:gridCol w:w="6179"/>
@@ -425,16 +733,27 @@
     <w:tr>
       <w:tc>
         <w:tcPr>
-          <w:tcW w:type="pct" w:w="3250"/>
+          <w:tcW w:w="3250" w:type="pct"/>
           <w:vAlign w:val="center"/>
         </w:tcPr>
         <w:p>
           <w:r>
+            <w:rPr>
+              <w:noProof/>
+            </w:rPr>
             <w:drawing>
-              <wp:inline distT="0" distB="0" distL="0" distR="0">
+              <wp:anchor distT="0" distB="0" distL="114300" distR="114300" simplePos="0" relativeHeight="251658240" behindDoc="0" locked="0" layoutInCell="1" allowOverlap="1" wp14:anchorId="44D38FE8" wp14:editId="011ECA36">
+                <wp:simplePos x="0" y="0"/>
+                <wp:positionH relativeFrom="column">
+                  <wp:posOffset>-68580</wp:posOffset>
+                </wp:positionH>
+                <wp:positionV relativeFrom="paragraph">
+                  <wp:posOffset>-46355</wp:posOffset>
+                </wp:positionV>
                 <wp:extent cx="323850" cy="323850"/>
-                <wp:effectExtent t="0" r="0" b="0" l="0"/>
-                <wp:docPr id="1" name=""/>
+                <wp:effectExtent l="0" t="0" r="0" b="0"/>
+                <wp:wrapNone/>
+                <wp:docPr id="1" name="Imagen 1"/>
                 <wp:cNvGraphicFramePr>
                   <a:graphicFrameLocks xmlns:a="http://schemas.openxmlformats.org/drawingml/2006/main" noChangeAspect="1"/>
                 </wp:cNvGraphicFramePr>
@@ -442,13 +761,19 @@
                   <a:graphicData uri="http://schemas.openxmlformats.org/drawingml/2006/picture">
                     <pic:pic xmlns:pic="http://schemas.openxmlformats.org/drawingml/2006/picture">
                       <pic:nvPicPr>
-                        <pic:cNvPr id="0" name="" descr=""/>
+                        <pic:cNvPr id="0" name=""/>
                         <pic:cNvPicPr>
                           <a:picLocks noChangeAspect="1" noChangeArrowheads="1"/>
                         </pic:cNvPicPr>
                       </pic:nvPicPr>
                       <pic:blipFill>
-                        <a:blip r:embed="rId0" cstate="none"/>
+                        <a:blip r:embed="rId1">
+                          <a:extLst>
+                            <a:ext uri="{28A0092B-C50C-407E-A947-70E740481C1C}">
+                              <a14:useLocalDpi xmlns:a14="http://schemas.microsoft.com/office/drawing/2010/main" val="0"/>
+                            </a:ext>
+                          </a:extLst>
+                        </a:blip>
                         <a:srcRect/>
                         <a:stretch>
                           <a:fillRect/>
@@ -466,7 +791,13 @@
                     </pic:pic>
                   </a:graphicData>
                 </a:graphic>
-              </wp:inline>
+                <wp14:sizeRelH relativeFrom="page">
+                  <wp14:pctWidth>0</wp14:pctWidth>
+                </wp14:sizeRelH>
+                <wp14:sizeRelV relativeFrom="page">
+                  <wp14:pctHeight>0</wp14:pctHeight>
+                </wp14:sizeRelV>
+              </wp:anchor>
             </w:drawing>
           </w:r>
           <w:r>
@@ -477,8 +808,20 @@
               <w:sz w:val="28"/>
               <w:szCs w:val="28"/>
             </w:rPr>
-            <w:t xml:space="preserve">  testform</w:t>
+            <w:t xml:space="preserve">      </w:t>
           </w:r>
+          <w:proofErr w:type="spellStart"/>
+          <w:r>
+            <w:rPr>
+              <w:b/>
+              <w:bCs/>
+              <w:color w:val="0284C7"/>
+              <w:sz w:val="28"/>
+              <w:szCs w:val="28"/>
+            </w:rPr>
+            <w:t>testform</w:t>
+          </w:r>
+          <w:proofErr w:type="spellEnd"/>
           <w:r>
             <w:rPr>
               <w:color w:val="64748B"/>
@@ -491,7 +834,7 @@
       </w:tc>
       <w:tc>
         <w:tcPr>
-          <w:tcW w:type="pct" w:w="1750"/>
+          <w:tcW w:w="1750" w:type="pct"/>
           <w:vAlign w:val="center"/>
         </w:tcPr>
         <w:p>
@@ -502,12 +845,11 @@
             <w:rPr>
               <w:b/>
               <w:bCs/>
-              <w:color w:val="94A3B8"/>
-              <w:sz w:val="16"/>
-              <w:szCs w:val="16"/>
+              <w:color w:val="64748B"/>
+              <w:sz w:val="18"/>
+              <w:szCs w:val="18"/>
             </w:rPr>
-            <w:t xml:space="preserve">REPORTE DE EJECUCIÓN
-</w:t>
+            <w:t>DATE</w:t>
           </w:r>
           <w:r>
             <w:rPr>
@@ -517,7 +859,7 @@
               <w:sz w:val="18"/>
               <w:szCs w:val="18"/>
             </w:rPr>
-            <w:t xml:space="preserve">Fecha: </w:t>
+            <w:t xml:space="preserve">: </w:t>
           </w:r>
           <w:r>
             <w:rPr>
@@ -525,7 +867,7 @@
               <w:sz w:val="18"/>
               <w:szCs w:val="18"/>
             </w:rPr>
-            <w:t xml:space="preserve">${date}</w:t>
+            <w:t>${date}</w:t>
           </w:r>
         </w:p>
       </w:tc>
@@ -535,10 +877,12 @@
 </file>
 
 <file path=word/numbering.xml><?xml version="1.0" encoding="utf-8"?>
-<w:numbering xmlns:wpc="http://schemas.microsoft.com/office/word/2010/wordprocessingCanvas" xmlns:mc="http://schemas.openxmlformats.org/markup-compatibility/2006" xmlns:o="urn:schemas-microsoft-com:office:office" xmlns:r="http://schemas.openxmlformats.org/officeDocument/2006/relationships" xmlns:m="http://schemas.openxmlformats.org/officeDocument/2006/math" xmlns:v="urn:schemas-microsoft-com:vml" xmlns:wp14="http://schemas.microsoft.com/office/word/2010/wordprocessingDrawing" xmlns:wp="http://schemas.openxmlformats.org/drawingml/2006/wordprocessingDrawing" xmlns:w10="urn:schemas-microsoft-com:office:word" xmlns:w="http://schemas.openxmlformats.org/wordprocessingml/2006/main" xmlns:w14="http://schemas.microsoft.com/office/word/2010/wordml" xmlns:w15="http://schemas.microsoft.com/office/word/2012/wordml" xmlns:wpg="http://schemas.microsoft.com/office/word/2010/wordprocessingGroup" xmlns:wpi="http://schemas.microsoft.com/office/word/2010/wordprocessingInk" xmlns:wne="http://schemas.microsoft.com/office/word/2006/wordml" xmlns:wps="http://schemas.microsoft.com/office/word/2010/wordprocessingShape" mc:Ignorable="w14 w15 wp14">
-  <w:abstractNum w:abstractNumId="1" w15:restartNumberingAfterBreak="0">
+<w:numbering xmlns:wpc="http://schemas.microsoft.com/office/word/2010/wordprocessingCanvas" xmlns:cx="http://schemas.microsoft.com/office/drawing/2014/chartex" xmlns:cx1="http://schemas.microsoft.com/office/drawing/2015/9/8/chartex" xmlns:cx2="http://schemas.microsoft.com/office/drawing/2015/10/21/chartex" xmlns:cx3="http://schemas.microsoft.com/office/drawing/2016/5/9/chartex" xmlns:cx4="http://schemas.microsoft.com/office/drawing/2016/5/10/chartex" xmlns:cx5="http://schemas.microsoft.com/office/drawing/2016/5/11/chartex" xmlns:cx6="http://schemas.microsoft.com/office/drawing/2016/5/12/chartex" xmlns:cx7="http://schemas.microsoft.com/office/drawing/2016/5/13/chartex" xmlns:cx8="http://schemas.microsoft.com/office/drawing/2016/5/14/chartex" xmlns:mc="http://schemas.openxmlformats.org/markup-compatibility/2006" xmlns:aink="http://schemas.microsoft.com/office/drawing/2016/ink" xmlns:am3d="http://schemas.microsoft.com/office/drawing/2017/model3d" xmlns:o="urn:schemas-microsoft-com:office:office" xmlns:oel="http://schemas.microsoft.com/office/2019/extlst" xmlns:r="http://schemas.openxmlformats.org/officeDocument/2006/relationships" xmlns:m="http://schemas.openxmlformats.org/officeDocument/2006/math" xmlns:v="urn:schemas-microsoft-com:vml" xmlns:wp14="http://schemas.microsoft.com/office/word/2010/wordprocessingDrawing" xmlns:wp="http://schemas.openxmlformats.org/drawingml/2006/wordprocessingDrawing" xmlns:w10="urn:schemas-microsoft-com:office:word" xmlns:w="http://schemas.openxmlformats.org/wordprocessingml/2006/main" xmlns:w14="http://schemas.microsoft.com/office/word/2010/wordml" xmlns:w15="http://schemas.microsoft.com/office/word/2012/wordml" xmlns:w16cex="http://schemas.microsoft.com/office/word/2018/wordml/cex" xmlns:w16cid="http://schemas.microsoft.com/office/word/2016/wordml/cid" xmlns:w16="http://schemas.microsoft.com/office/word/2018/wordml" xmlns:w16du="http://schemas.microsoft.com/office/word/2023/wordml/word16du" xmlns:w16sdtdh="http://schemas.microsoft.com/office/word/2020/wordml/sdtdatahash" xmlns:w16sdtfl="http://schemas.microsoft.com/office/word/2024/wordml/sdtformatlock" xmlns:w16se="http://schemas.microsoft.com/office/word/2015/wordml/symex" xmlns:wpg="http://schemas.microsoft.com/office/word/2010/wordprocessingGroup" xmlns:wpi="http://schemas.microsoft.com/office/word/2010/wordprocessingInk" xmlns:wne="http://schemas.microsoft.com/office/word/2006/wordml" xmlns:wps="http://schemas.microsoft.com/office/word/2010/wordprocessingShape" mc:Ignorable="w14 w15 w16se w16cid w16 w16cex w16sdtdh w16sdtfl w16du wp14">
+  <w:abstractNum w:abstractNumId="0" w15:restartNumberingAfterBreak="0">
+    <w:nsid w:val="140F2E87"/>
     <w:multiLevelType w:val="hybridMultilevel"/>
-    <w:lvl w:ilvl="0" w:tentative="1">
+    <w:tmpl w:val="44806588"/>
+    <w:lvl w:ilvl="0" w:tplc="9A5C230E" w:tentative="1">
       <w:start w:val="1"/>
       <w:numFmt w:val="bullet"/>
       <w:lvlText w:val="●"/>
@@ -547,7 +891,7 @@
         <w:ind w:left="720" w:hanging="360"/>
       </w:pPr>
     </w:lvl>
-    <w:lvl w:ilvl="1" w:tentative="1">
+    <w:lvl w:ilvl="1" w:tplc="35CE67AE" w:tentative="1">
       <w:start w:val="1"/>
       <w:numFmt w:val="bullet"/>
       <w:lvlText w:val="○"/>
@@ -556,7 +900,7 @@
         <w:ind w:left="1440" w:hanging="360"/>
       </w:pPr>
     </w:lvl>
-    <w:lvl w:ilvl="2" w:tentative="1">
+    <w:lvl w:ilvl="2" w:tplc="1F80DE8A" w:tentative="1">
       <w:start w:val="1"/>
       <w:numFmt w:val="bullet"/>
       <w:lvlText w:val="■"/>
@@ -565,7 +909,7 @@
         <w:ind w:left="2160" w:hanging="360"/>
       </w:pPr>
     </w:lvl>
-    <w:lvl w:ilvl="3" w:tentative="1">
+    <w:lvl w:ilvl="3" w:tplc="04B03C9A" w:tentative="1">
       <w:start w:val="1"/>
       <w:numFmt w:val="bullet"/>
       <w:lvlText w:val="●"/>
@@ -574,7 +918,7 @@
         <w:ind w:left="2880" w:hanging="360"/>
       </w:pPr>
     </w:lvl>
-    <w:lvl w:ilvl="4" w:tentative="1">
+    <w:lvl w:ilvl="4" w:tplc="5748E840" w:tentative="1">
       <w:start w:val="1"/>
       <w:numFmt w:val="bullet"/>
       <w:lvlText w:val="○"/>
@@ -583,7 +927,7 @@
         <w:ind w:left="3600" w:hanging="360"/>
       </w:pPr>
     </w:lvl>
-    <w:lvl w:ilvl="5" w:tentative="1">
+    <w:lvl w:ilvl="5" w:tplc="64BC0482" w:tentative="1">
       <w:start w:val="1"/>
       <w:numFmt w:val="bullet"/>
       <w:lvlText w:val="■"/>
@@ -592,7 +936,7 @@
         <w:ind w:left="4320" w:hanging="360"/>
       </w:pPr>
     </w:lvl>
-    <w:lvl w:ilvl="6" w:tentative="1">
+    <w:lvl w:ilvl="6" w:tplc="73643B10" w:tentative="1">
       <w:start w:val="1"/>
       <w:numFmt w:val="bullet"/>
       <w:lvlText w:val="●"/>
@@ -601,7 +945,7 @@
         <w:ind w:left="5040" w:hanging="360"/>
       </w:pPr>
     </w:lvl>
-    <w:lvl w:ilvl="7" w:tentative="1">
+    <w:lvl w:ilvl="7" w:tplc="608A0C56" w:tentative="1">
       <w:start w:val="1"/>
       <w:numFmt w:val="bullet"/>
       <w:lvlText w:val="●"/>
@@ -610,7 +954,7 @@
         <w:ind w:left="5760" w:hanging="360"/>
       </w:pPr>
     </w:lvl>
-    <w:lvl w:ilvl="8" w:tentative="1">
+    <w:lvl w:ilvl="8" w:tplc="A20084E4" w:tentative="1">
       <w:start w:val="1"/>
       <w:numFmt w:val="bullet"/>
       <w:lvlText w:val="●"/>
@@ -620,8 +964,8 @@
       </w:pPr>
     </w:lvl>
   </w:abstractNum>
-  <w:num w:numId="1">
-    <w:abstractNumId w:val="1"/>
+  <w:num w:numId="1" w16cid:durableId="548230355">
+    <w:abstractNumId w:val="0"/>
     <w:lvlOverride w:ilvl="0">
       <w:startOverride w:val="1"/>
     </w:lvlOverride>
@@ -630,111 +974,537 @@
 </file>
 
 <file path=word/styles.xml><?xml version="1.0" encoding="utf-8"?>
-<w:styles xmlns:mc="http://schemas.openxmlformats.org/markup-compatibility/2006" xmlns:r="http://schemas.openxmlformats.org/officeDocument/2006/relationships" xmlns:w="http://schemas.openxmlformats.org/wordprocessingml/2006/main" xmlns:w14="http://schemas.microsoft.com/office/word/2010/wordml" xmlns:w15="http://schemas.microsoft.com/office/word/2012/wordml" mc:Ignorable="w14 w15">
+<w:styles xmlns:mc="http://schemas.openxmlformats.org/markup-compatibility/2006" xmlns:r="http://schemas.openxmlformats.org/officeDocument/2006/relationships" xmlns:w="http://schemas.openxmlformats.org/wordprocessingml/2006/main" xmlns:w14="http://schemas.microsoft.com/office/word/2010/wordml" xmlns:w15="http://schemas.microsoft.com/office/word/2012/wordml" xmlns:w16cex="http://schemas.microsoft.com/office/word/2018/wordml/cex" xmlns:w16cid="http://schemas.microsoft.com/office/word/2016/wordml/cid" xmlns:w16="http://schemas.microsoft.com/office/word/2018/wordml" xmlns:w16du="http://schemas.microsoft.com/office/word/2023/wordml/word16du" xmlns:w16sdtdh="http://schemas.microsoft.com/office/word/2020/wordml/sdtdatahash" xmlns:w16sdtfl="http://schemas.microsoft.com/office/word/2024/wordml/sdtformatlock" xmlns:w16se="http://schemas.microsoft.com/office/word/2015/wordml/symex" mc:Ignorable="w14 w15 w16se w16cid w16 w16cex w16sdtdh w16sdtfl w16du">
   <w:docDefaults>
     <w:rPrDefault>
       <w:rPr>
-        <w:rFonts w:ascii="Segoe UI" w:cs="Segoe UI" w:eastAsia="Segoe UI" w:hAnsi="Segoe UI"/>
+        <w:rFonts w:ascii="Segoe UI" w:eastAsia="Segoe UI" w:hAnsi="Segoe UI" w:cs="Segoe UI"/>
         <w:color w:val="334155"/>
         <w:sz w:val="21"/>
         <w:szCs w:val="21"/>
+        <w:lang w:val="es-PE" w:eastAsia="es-PE" w:bidi="ar-SA"/>
       </w:rPr>
     </w:rPrDefault>
     <w:pPrDefault/>
   </w:docDefaults>
-  <w:style w:type="paragraph" w:styleId="Normal" w:default="1">
+  <w:latentStyles w:defLockedState="0" w:defUIPriority="99" w:defSemiHidden="0" w:defUnhideWhenUsed="0" w:defQFormat="0" w:count="376">
+    <w:lsdException w:name="Normal" w:uiPriority="0" w:qFormat="1"/>
+    <w:lsdException w:name="heading 1" w:uiPriority="9" w:qFormat="1"/>
+    <w:lsdException w:name="heading 2" w:semiHidden="1" w:uiPriority="9" w:unhideWhenUsed="1" w:qFormat="1"/>
+    <w:lsdException w:name="heading 3" w:semiHidden="1" w:uiPriority="9" w:unhideWhenUsed="1" w:qFormat="1"/>
+    <w:lsdException w:name="heading 4" w:semiHidden="1" w:uiPriority="9" w:unhideWhenUsed="1" w:qFormat="1"/>
+    <w:lsdException w:name="heading 5" w:semiHidden="1" w:uiPriority="9" w:unhideWhenUsed="1" w:qFormat="1"/>
+    <w:lsdException w:name="heading 6" w:semiHidden="1" w:uiPriority="9" w:unhideWhenUsed="1" w:qFormat="1"/>
+    <w:lsdException w:name="heading 7" w:semiHidden="1" w:uiPriority="9" w:unhideWhenUsed="1" w:qFormat="1"/>
+    <w:lsdException w:name="heading 8" w:semiHidden="1" w:uiPriority="9" w:unhideWhenUsed="1" w:qFormat="1"/>
+    <w:lsdException w:name="heading 9" w:semiHidden="1" w:uiPriority="9" w:unhideWhenUsed="1" w:qFormat="1"/>
+    <w:lsdException w:name="index 1" w:semiHidden="1" w:unhideWhenUsed="1"/>
+    <w:lsdException w:name="index 2" w:semiHidden="1" w:unhideWhenUsed="1"/>
+    <w:lsdException w:name="index 3" w:semiHidden="1" w:unhideWhenUsed="1"/>
+    <w:lsdException w:name="index 4" w:semiHidden="1" w:unhideWhenUsed="1"/>
+    <w:lsdException w:name="index 5" w:semiHidden="1" w:unhideWhenUsed="1"/>
+    <w:lsdException w:name="index 6" w:semiHidden="1" w:unhideWhenUsed="1"/>
+    <w:lsdException w:name="index 7" w:semiHidden="1" w:unhideWhenUsed="1"/>
+    <w:lsdException w:name="index 8" w:semiHidden="1" w:unhideWhenUsed="1"/>
+    <w:lsdException w:name="index 9" w:semiHidden="1" w:unhideWhenUsed="1"/>
+    <w:lsdException w:name="toc 1" w:semiHidden="1" w:uiPriority="39" w:unhideWhenUsed="1"/>
+    <w:lsdException w:name="toc 2" w:semiHidden="1" w:uiPriority="39" w:unhideWhenUsed="1"/>
+    <w:lsdException w:name="toc 3" w:semiHidden="1" w:uiPriority="39" w:unhideWhenUsed="1"/>
+    <w:lsdException w:name="toc 4" w:semiHidden="1" w:uiPriority="39" w:unhideWhenUsed="1"/>
+    <w:lsdException w:name="toc 5" w:semiHidden="1" w:uiPriority="39" w:unhideWhenUsed="1"/>
+    <w:lsdException w:name="toc 6" w:semiHidden="1" w:uiPriority="39" w:unhideWhenUsed="1"/>
+    <w:lsdException w:name="toc 7" w:semiHidden="1" w:uiPriority="39" w:unhideWhenUsed="1"/>
+    <w:lsdException w:name="toc 8" w:semiHidden="1" w:uiPriority="39" w:unhideWhenUsed="1"/>
+    <w:lsdException w:name="toc 9" w:semiHidden="1" w:uiPriority="39" w:unhideWhenUsed="1"/>
+    <w:lsdException w:name="Normal Indent" w:semiHidden="1" w:unhideWhenUsed="1"/>
+    <w:lsdException w:name="footnote text" w:semiHidden="1" w:unhideWhenUsed="1"/>
+    <w:lsdException w:name="annotation text" w:semiHidden="1" w:unhideWhenUsed="1"/>
+    <w:lsdException w:name="header" w:semiHidden="1" w:unhideWhenUsed="1"/>
+    <w:lsdException w:name="footer" w:semiHidden="1" w:unhideWhenUsed="1"/>
+    <w:lsdException w:name="index heading" w:semiHidden="1" w:unhideWhenUsed="1"/>
+    <w:lsdException w:name="caption" w:semiHidden="1" w:uiPriority="35" w:unhideWhenUsed="1" w:qFormat="1"/>
+    <w:lsdException w:name="table of figures" w:semiHidden="1" w:unhideWhenUsed="1"/>
+    <w:lsdException w:name="envelope address" w:semiHidden="1" w:unhideWhenUsed="1"/>
+    <w:lsdException w:name="envelope return" w:semiHidden="1" w:unhideWhenUsed="1"/>
+    <w:lsdException w:name="footnote reference" w:semiHidden="1" w:unhideWhenUsed="1"/>
+    <w:lsdException w:name="annotation reference" w:semiHidden="1" w:unhideWhenUsed="1"/>
+    <w:lsdException w:name="line number" w:semiHidden="1" w:unhideWhenUsed="1"/>
+    <w:lsdException w:name="page number" w:semiHidden="1" w:unhideWhenUsed="1"/>
+    <w:lsdException w:name="endnote reference" w:semiHidden="1" w:unhideWhenUsed="1"/>
+    <w:lsdException w:name="endnote text" w:semiHidden="1" w:unhideWhenUsed="1"/>
+    <w:lsdException w:name="table of authorities" w:semiHidden="1" w:unhideWhenUsed="1"/>
+    <w:lsdException w:name="macro" w:semiHidden="1" w:unhideWhenUsed="1"/>
+    <w:lsdException w:name="toa heading" w:semiHidden="1" w:unhideWhenUsed="1"/>
+    <w:lsdException w:name="List" w:semiHidden="1" w:unhideWhenUsed="1"/>
+    <w:lsdException w:name="List Bullet" w:semiHidden="1" w:unhideWhenUsed="1"/>
+    <w:lsdException w:name="List Number" w:semiHidden="1" w:unhideWhenUsed="1"/>
+    <w:lsdException w:name="List 2" w:semiHidden="1" w:unhideWhenUsed="1"/>
+    <w:lsdException w:name="List 3" w:semiHidden="1" w:unhideWhenUsed="1"/>
+    <w:lsdException w:name="List 4" w:semiHidden="1" w:unhideWhenUsed="1"/>
+    <w:lsdException w:name="List 5" w:semiHidden="1" w:unhideWhenUsed="1"/>
+    <w:lsdException w:name="List Bullet 2" w:semiHidden="1" w:unhideWhenUsed="1"/>
+    <w:lsdException w:name="List Bullet 3" w:semiHidden="1" w:unhideWhenUsed="1"/>
+    <w:lsdException w:name="List Bullet 4" w:semiHidden="1" w:unhideWhenUsed="1"/>
+    <w:lsdException w:name="List Bullet 5" w:semiHidden="1" w:unhideWhenUsed="1"/>
+    <w:lsdException w:name="List Number 2" w:semiHidden="1" w:unhideWhenUsed="1"/>
+    <w:lsdException w:name="List Number 3" w:semiHidden="1" w:unhideWhenUsed="1"/>
+    <w:lsdException w:name="List Number 4" w:semiHidden="1" w:unhideWhenUsed="1"/>
+    <w:lsdException w:name="List Number 5" w:semiHidden="1" w:unhideWhenUsed="1"/>
+    <w:lsdException w:name="Title" w:uiPriority="10" w:qFormat="1"/>
+    <w:lsdException w:name="Closing" w:semiHidden="1" w:unhideWhenUsed="1"/>
+    <w:lsdException w:name="Signature" w:semiHidden="1" w:unhideWhenUsed="1"/>
+    <w:lsdException w:name="Default Paragraph Font" w:semiHidden="1" w:uiPriority="1" w:unhideWhenUsed="1"/>
+    <w:lsdException w:name="Body Text" w:semiHidden="1" w:unhideWhenUsed="1"/>
+    <w:lsdException w:name="Body Text Indent" w:semiHidden="1" w:unhideWhenUsed="1"/>
+    <w:lsdException w:name="List Continue" w:semiHidden="1" w:unhideWhenUsed="1"/>
+    <w:lsdException w:name="List Continue 2" w:semiHidden="1" w:unhideWhenUsed="1"/>
+    <w:lsdException w:name="List Continue 3" w:semiHidden="1" w:unhideWhenUsed="1"/>
+    <w:lsdException w:name="List Continue 4" w:semiHidden="1" w:unhideWhenUsed="1"/>
+    <w:lsdException w:name="List Continue 5" w:semiHidden="1" w:unhideWhenUsed="1"/>
+    <w:lsdException w:name="Message Header" w:semiHidden="1" w:unhideWhenUsed="1"/>
+    <w:lsdException w:name="Subtitle" w:uiPriority="11" w:qFormat="1"/>
+    <w:lsdException w:name="Salutation" w:semiHidden="1" w:unhideWhenUsed="1"/>
+    <w:lsdException w:name="Date" w:semiHidden="1" w:unhideWhenUsed="1"/>
+    <w:lsdException w:name="Body Text First Indent" w:semiHidden="1" w:unhideWhenUsed="1"/>
+    <w:lsdException w:name="Body Text First Indent 2" w:semiHidden="1" w:unhideWhenUsed="1"/>
+    <w:lsdException w:name="Note Heading" w:semiHidden="1" w:unhideWhenUsed="1"/>
+    <w:lsdException w:name="Body Text 2" w:semiHidden="1" w:unhideWhenUsed="1"/>
+    <w:lsdException w:name="Body Text 3" w:semiHidden="1" w:unhideWhenUsed="1"/>
+    <w:lsdException w:name="Body Text Indent 2" w:semiHidden="1" w:unhideWhenUsed="1"/>
+    <w:lsdException w:name="Body Text Indent 3" w:semiHidden="1" w:unhideWhenUsed="1"/>
+    <w:lsdException w:name="Block Text" w:semiHidden="1" w:unhideWhenUsed="1"/>
+    <w:lsdException w:name="Hyperlink" w:semiHidden="1" w:unhideWhenUsed="1"/>
+    <w:lsdException w:name="FollowedHyperlink" w:semiHidden="1" w:unhideWhenUsed="1"/>
+    <w:lsdException w:name="Strong" w:uiPriority="22" w:qFormat="1"/>
+    <w:lsdException w:name="Emphasis" w:uiPriority="20" w:qFormat="1"/>
+    <w:lsdException w:name="Document Map" w:semiHidden="1" w:unhideWhenUsed="1"/>
+    <w:lsdException w:name="Plain Text" w:semiHidden="1" w:unhideWhenUsed="1"/>
+    <w:lsdException w:name="E-mail Signature" w:semiHidden="1" w:unhideWhenUsed="1"/>
+    <w:lsdException w:name="HTML Top of Form" w:semiHidden="1" w:unhideWhenUsed="1"/>
+    <w:lsdException w:name="HTML Bottom of Form" w:semiHidden="1" w:unhideWhenUsed="1"/>
+    <w:lsdException w:name="Normal (Web)" w:semiHidden="1" w:unhideWhenUsed="1"/>
+    <w:lsdException w:name="HTML Acronym" w:semiHidden="1" w:unhideWhenUsed="1"/>
+    <w:lsdException w:name="HTML Address" w:semiHidden="1" w:unhideWhenUsed="1"/>
+    <w:lsdException w:name="HTML Cite" w:semiHidden="1" w:unhideWhenUsed="1"/>
+    <w:lsdException w:name="HTML Code" w:semiHidden="1" w:unhideWhenUsed="1"/>
+    <w:lsdException w:name="HTML Definition" w:semiHidden="1" w:unhideWhenUsed="1"/>
+    <w:lsdException w:name="HTML Keyboard" w:semiHidden="1" w:unhideWhenUsed="1"/>
+    <w:lsdException w:name="HTML Preformatted" w:semiHidden="1" w:unhideWhenUsed="1"/>
+    <w:lsdException w:name="HTML Sample" w:semiHidden="1" w:unhideWhenUsed="1"/>
+    <w:lsdException w:name="HTML Typewriter" w:semiHidden="1" w:unhideWhenUsed="1"/>
+    <w:lsdException w:name="HTML Variable" w:semiHidden="1" w:unhideWhenUsed="1"/>
+    <w:lsdException w:name="Normal Table" w:semiHidden="1" w:unhideWhenUsed="1"/>
+    <w:lsdException w:name="annotation subject" w:semiHidden="1" w:unhideWhenUsed="1"/>
+    <w:lsdException w:name="No List" w:semiHidden="1" w:unhideWhenUsed="1"/>
+    <w:lsdException w:name="Outline List 1" w:semiHidden="1" w:unhideWhenUsed="1"/>
+    <w:lsdException w:name="Outline List 2" w:semiHidden="1" w:unhideWhenUsed="1"/>
+    <w:lsdException w:name="Outline List 3" w:semiHidden="1" w:unhideWhenUsed="1"/>
+    <w:lsdException w:name="Table Simple 1" w:semiHidden="1" w:unhideWhenUsed="1"/>
+    <w:lsdException w:name="Table Simple 2" w:semiHidden="1" w:unhideWhenUsed="1"/>
+    <w:lsdException w:name="Table Simple 3" w:semiHidden="1" w:unhideWhenUsed="1"/>
+    <w:lsdException w:name="Table Classic 1" w:semiHidden="1" w:unhideWhenUsed="1"/>
+    <w:lsdException w:name="Table Classic 2" w:semiHidden="1" w:unhideWhenUsed="1"/>
+    <w:lsdException w:name="Table Classic 3" w:semiHidden="1" w:unhideWhenUsed="1"/>
+    <w:lsdException w:name="Table Classic 4" w:semiHidden="1" w:unhideWhenUsed="1"/>
+    <w:lsdException w:name="Table Colorful 1" w:semiHidden="1" w:unhideWhenUsed="1"/>
+    <w:lsdException w:name="Table Colorful 2" w:semiHidden="1" w:unhideWhenUsed="1"/>
+    <w:lsdException w:name="Table Colorful 3" w:semiHidden="1" w:unhideWhenUsed="1"/>
+    <w:lsdException w:name="Table Columns 1" w:semiHidden="1" w:unhideWhenUsed="1"/>
+    <w:lsdException w:name="Table Columns 2" w:semiHidden="1" w:unhideWhenUsed="1"/>
+    <w:lsdException w:name="Table Columns 3" w:semiHidden="1" w:unhideWhenUsed="1"/>
+    <w:lsdException w:name="Table Columns 4" w:semiHidden="1" w:unhideWhenUsed="1"/>
+    <w:lsdException w:name="Table Columns 5" w:semiHidden="1" w:unhideWhenUsed="1"/>
+    <w:lsdException w:name="Table Grid 1" w:semiHidden="1" w:unhideWhenUsed="1"/>
+    <w:lsdException w:name="Table Grid 2" w:semiHidden="1" w:unhideWhenUsed="1"/>
+    <w:lsdException w:name="Table Grid 3" w:semiHidden="1" w:unhideWhenUsed="1"/>
+    <w:lsdException w:name="Table Grid 4" w:semiHidden="1" w:unhideWhenUsed="1"/>
+    <w:lsdException w:name="Table Grid 5" w:semiHidden="1" w:unhideWhenUsed="1"/>
+    <w:lsdException w:name="Table Grid 6" w:semiHidden="1" w:unhideWhenUsed="1"/>
+    <w:lsdException w:name="Table Grid 7" w:semiHidden="1" w:unhideWhenUsed="1"/>
+    <w:lsdException w:name="Table Grid 8" w:semiHidden="1" w:unhideWhenUsed="1"/>
+    <w:lsdException w:name="Table List 1" w:semiHidden="1" w:unhideWhenUsed="1"/>
+    <w:lsdException w:name="Table List 2" w:semiHidden="1" w:unhideWhenUsed="1"/>
+    <w:lsdException w:name="Table List 3" w:semiHidden="1" w:unhideWhenUsed="1"/>
+    <w:lsdException w:name="Table List 4" w:semiHidden="1" w:unhideWhenUsed="1"/>
+    <w:lsdException w:name="Table List 5" w:semiHidden="1" w:unhideWhenUsed="1"/>
+    <w:lsdException w:name="Table List 6" w:semiHidden="1" w:unhideWhenUsed="1"/>
+    <w:lsdException w:name="Table List 7" w:semiHidden="1" w:unhideWhenUsed="1"/>
+    <w:lsdException w:name="Table List 8" w:semiHidden="1" w:unhideWhenUsed="1"/>
+    <w:lsdException w:name="Table 3D effects 1" w:semiHidden="1" w:unhideWhenUsed="1"/>
+    <w:lsdException w:name="Table 3D effects 2" w:semiHidden="1" w:unhideWhenUsed="1"/>
+    <w:lsdException w:name="Table 3D effects 3" w:semiHidden="1" w:unhideWhenUsed="1"/>
+    <w:lsdException w:name="Table Contemporary" w:semiHidden="1" w:unhideWhenUsed="1"/>
+    <w:lsdException w:name="Table Elegant" w:semiHidden="1" w:unhideWhenUsed="1"/>
+    <w:lsdException w:name="Table Professional" w:semiHidden="1" w:unhideWhenUsed="1"/>
+    <w:lsdException w:name="Table Subtle 1" w:semiHidden="1" w:unhideWhenUsed="1"/>
+    <w:lsdException w:name="Table Subtle 2" w:semiHidden="1" w:unhideWhenUsed="1"/>
+    <w:lsdException w:name="Table Web 1" w:semiHidden="1" w:unhideWhenUsed="1"/>
+    <w:lsdException w:name="Table Web 2" w:semiHidden="1" w:unhideWhenUsed="1"/>
+    <w:lsdException w:name="Table Web 3" w:semiHidden="1" w:unhideWhenUsed="1"/>
+    <w:lsdException w:name="Balloon Text" w:semiHidden="1" w:unhideWhenUsed="1"/>
+    <w:lsdException w:name="Table Grid" w:uiPriority="39"/>
+    <w:lsdException w:name="Table Theme" w:semiHidden="1" w:unhideWhenUsed="1"/>
+    <w:lsdException w:name="Placeholder Text" w:semiHidden="1"/>
+    <w:lsdException w:name="No Spacing" w:uiPriority="1" w:qFormat="1"/>
+    <w:lsdException w:name="Light Shading" w:uiPriority="60"/>
+    <w:lsdException w:name="Light List" w:uiPriority="61"/>
+    <w:lsdException w:name="Light Grid" w:uiPriority="62"/>
+    <w:lsdException w:name="Medium Shading 1" w:uiPriority="63"/>
+    <w:lsdException w:name="Medium Shading 2" w:uiPriority="64"/>
+    <w:lsdException w:name="Medium List 1" w:uiPriority="65"/>
+    <w:lsdException w:name="Medium List 2" w:uiPriority="66"/>
+    <w:lsdException w:name="Medium Grid 1" w:uiPriority="67"/>
+    <w:lsdException w:name="Medium Grid 2" w:uiPriority="68"/>
+    <w:lsdException w:name="Medium Grid 3" w:uiPriority="69"/>
+    <w:lsdException w:name="Dark List" w:uiPriority="70"/>
+    <w:lsdException w:name="Colorful Shading" w:uiPriority="71"/>
+    <w:lsdException w:name="Colorful List" w:uiPriority="72"/>
+    <w:lsdException w:name="Colorful Grid" w:uiPriority="73"/>
+    <w:lsdException w:name="Light Shading Accent 1" w:uiPriority="60"/>
+    <w:lsdException w:name="Light List Accent 1" w:uiPriority="61"/>
+    <w:lsdException w:name="Light Grid Accent 1" w:uiPriority="62"/>
+    <w:lsdException w:name="Medium Shading 1 Accent 1" w:uiPriority="63"/>
+    <w:lsdException w:name="Medium Shading 2 Accent 1" w:uiPriority="64"/>
+    <w:lsdException w:name="Medium List 1 Accent 1" w:uiPriority="65"/>
+    <w:lsdException w:name="Revision" w:semiHidden="1"/>
+    <w:lsdException w:name="List Paragraph" w:uiPriority="34" w:qFormat="1"/>
+    <w:lsdException w:name="Quote" w:uiPriority="29" w:qFormat="1"/>
+    <w:lsdException w:name="Intense Quote" w:uiPriority="30" w:qFormat="1"/>
+    <w:lsdException w:name="Medium List 2 Accent 1" w:uiPriority="66"/>
+    <w:lsdException w:name="Medium Grid 1 Accent 1" w:uiPriority="67"/>
+    <w:lsdException w:name="Medium Grid 2 Accent 1" w:uiPriority="68"/>
+    <w:lsdException w:name="Medium Grid 3 Accent 1" w:uiPriority="69"/>
+    <w:lsdException w:name="Dark List Accent 1" w:uiPriority="70"/>
+    <w:lsdException w:name="Colorful Shading Accent 1" w:uiPriority="71"/>
+    <w:lsdException w:name="Colorful List Accent 1" w:uiPriority="72"/>
+    <w:lsdException w:name="Colorful Grid Accent 1" w:uiPriority="73"/>
+    <w:lsdException w:name="Light Shading Accent 2" w:uiPriority="60"/>
+    <w:lsdException w:name="Light List Accent 2" w:uiPriority="61"/>
+    <w:lsdException w:name="Light Grid Accent 2" w:uiPriority="62"/>
+    <w:lsdException w:name="Medium Shading 1 Accent 2" w:uiPriority="63"/>
+    <w:lsdException w:name="Medium Shading 2 Accent 2" w:uiPriority="64"/>
+    <w:lsdException w:name="Medium List 1 Accent 2" w:uiPriority="65"/>
+    <w:lsdException w:name="Medium List 2 Accent 2" w:uiPriority="66"/>
+    <w:lsdException w:name="Medium Grid 1 Accent 2" w:uiPriority="67"/>
+    <w:lsdException w:name="Medium Grid 2 Accent 2" w:uiPriority="68"/>
+    <w:lsdException w:name="Medium Grid 3 Accent 2" w:uiPriority="69"/>
+    <w:lsdException w:name="Dark List Accent 2" w:uiPriority="70"/>
+    <w:lsdException w:name="Colorful Shading Accent 2" w:uiPriority="71"/>
+    <w:lsdException w:name="Colorful List Accent 2" w:uiPriority="72"/>
+    <w:lsdException w:name="Colorful Grid Accent 2" w:uiPriority="73"/>
+    <w:lsdException w:name="Light Shading Accent 3" w:uiPriority="60"/>
+    <w:lsdException w:name="Light List Accent 3" w:uiPriority="61"/>
+    <w:lsdException w:name="Light Grid Accent 3" w:uiPriority="62"/>
+    <w:lsdException w:name="Medium Shading 1 Accent 3" w:uiPriority="63"/>
+    <w:lsdException w:name="Medium Shading 2 Accent 3" w:uiPriority="64"/>
+    <w:lsdException w:name="Medium List 1 Accent 3" w:uiPriority="65"/>
+    <w:lsdException w:name="Medium List 2 Accent 3" w:uiPriority="66"/>
+    <w:lsdException w:name="Medium Grid 1 Accent 3" w:uiPriority="67"/>
+    <w:lsdException w:name="Medium Grid 2 Accent 3" w:uiPriority="68"/>
+    <w:lsdException w:name="Medium Grid 3 Accent 3" w:uiPriority="69"/>
+    <w:lsdException w:name="Dark List Accent 3" w:uiPriority="70"/>
+    <w:lsdException w:name="Colorful Shading Accent 3" w:uiPriority="71"/>
+    <w:lsdException w:name="Colorful List Accent 3" w:uiPriority="72"/>
+    <w:lsdException w:name="Colorful Grid Accent 3" w:uiPriority="73"/>
+    <w:lsdException w:name="Light Shading Accent 4" w:uiPriority="60"/>
+    <w:lsdException w:name="Light List Accent 4" w:uiPriority="61"/>
+    <w:lsdException w:name="Light Grid Accent 4" w:uiPriority="62"/>
+    <w:lsdException w:name="Medium Shading 1 Accent 4" w:uiPriority="63"/>
+    <w:lsdException w:name="Medium Shading 2 Accent 4" w:uiPriority="64"/>
+    <w:lsdException w:name="Medium List 1 Accent 4" w:uiPriority="65"/>
+    <w:lsdException w:name="Medium List 2 Accent 4" w:uiPriority="66"/>
+    <w:lsdException w:name="Medium Grid 1 Accent 4" w:uiPriority="67"/>
+    <w:lsdException w:name="Medium Grid 2 Accent 4" w:uiPriority="68"/>
+    <w:lsdException w:name="Medium Grid 3 Accent 4" w:uiPriority="69"/>
+    <w:lsdException w:name="Dark List Accent 4" w:uiPriority="70"/>
+    <w:lsdException w:name="Colorful Shading Accent 4" w:uiPriority="71"/>
+    <w:lsdException w:name="Colorful List Accent 4" w:uiPriority="72"/>
+    <w:lsdException w:name="Colorful Grid Accent 4" w:uiPriority="73"/>
+    <w:lsdException w:name="Light Shading Accent 5" w:uiPriority="60"/>
+    <w:lsdException w:name="Light List Accent 5" w:uiPriority="61"/>
+    <w:lsdException w:name="Light Grid Accent 5" w:uiPriority="62"/>
+    <w:lsdException w:name="Medium Shading 1 Accent 5" w:uiPriority="63"/>
+    <w:lsdException w:name="Medium Shading 2 Accent 5" w:uiPriority="64"/>
+    <w:lsdException w:name="Medium List 1 Accent 5" w:uiPriority="65"/>
+    <w:lsdException w:name="Medium List 2 Accent 5" w:uiPriority="66"/>
+    <w:lsdException w:name="Medium Grid 1 Accent 5" w:uiPriority="67"/>
+    <w:lsdException w:name="Medium Grid 2 Accent 5" w:uiPriority="68"/>
+    <w:lsdException w:name="Medium Grid 3 Accent 5" w:uiPriority="69"/>
+    <w:lsdException w:name="Dark List Accent 5" w:uiPriority="70"/>
+    <w:lsdException w:name="Colorful Shading Accent 5" w:uiPriority="71"/>
+    <w:lsdException w:name="Colorful List Accent 5" w:uiPriority="72"/>
+    <w:lsdException w:name="Colorful Grid Accent 5" w:uiPriority="73"/>
+    <w:lsdException w:name="Light Shading Accent 6" w:uiPriority="60"/>
+    <w:lsdException w:name="Light List Accent 6" w:uiPriority="61"/>
+    <w:lsdException w:name="Light Grid Accent 6" w:uiPriority="62"/>
+    <w:lsdException w:name="Medium Shading 1 Accent 6" w:uiPriority="63"/>
+    <w:lsdException w:name="Medium Shading 2 Accent 6" w:uiPriority="64"/>
+    <w:lsdException w:name="Medium List 1 Accent 6" w:uiPriority="65"/>
+    <w:lsdException w:name="Medium List 2 Accent 6" w:uiPriority="66"/>
+    <w:lsdException w:name="Medium Grid 1 Accent 6" w:uiPriority="67"/>
+    <w:lsdException w:name="Medium Grid 2 Accent 6" w:uiPriority="68"/>
+    <w:lsdException w:name="Medium Grid 3 Accent 6" w:uiPriority="69"/>
+    <w:lsdException w:name="Dark List Accent 6" w:uiPriority="70"/>
+    <w:lsdException w:name="Colorful Shading Accent 6" w:uiPriority="71"/>
+    <w:lsdException w:name="Colorful List Accent 6" w:uiPriority="72"/>
+    <w:lsdException w:name="Colorful Grid Accent 6" w:uiPriority="73"/>
+    <w:lsdException w:name="Subtle Emphasis" w:uiPriority="19" w:qFormat="1"/>
+    <w:lsdException w:name="Intense Emphasis" w:uiPriority="21" w:qFormat="1"/>
+    <w:lsdException w:name="Subtle Reference" w:uiPriority="31" w:qFormat="1"/>
+    <w:lsdException w:name="Intense Reference" w:uiPriority="32" w:qFormat="1"/>
+    <w:lsdException w:name="Book Title" w:uiPriority="33" w:qFormat="1"/>
+    <w:lsdException w:name="Bibliography" w:semiHidden="1" w:uiPriority="37" w:unhideWhenUsed="1"/>
+    <w:lsdException w:name="TOC Heading" w:semiHidden="1" w:uiPriority="39" w:unhideWhenUsed="1" w:qFormat="1"/>
+    <w:lsdException w:name="Plain Table 1" w:uiPriority="41"/>
+    <w:lsdException w:name="Plain Table 2" w:uiPriority="42"/>
+    <w:lsdException w:name="Plain Table 3" w:uiPriority="43"/>
+    <w:lsdException w:name="Plain Table 4" w:uiPriority="44"/>
+    <w:lsdException w:name="Plain Table 5" w:uiPriority="45"/>
+    <w:lsdException w:name="Grid Table Light" w:uiPriority="40"/>
+    <w:lsdException w:name="Grid Table 1 Light" w:uiPriority="46"/>
+    <w:lsdException w:name="Grid Table 2" w:uiPriority="47"/>
+    <w:lsdException w:name="Grid Table 3" w:uiPriority="48"/>
+    <w:lsdException w:name="Grid Table 4" w:uiPriority="49"/>
+    <w:lsdException w:name="Grid Table 5 Dark" w:uiPriority="50"/>
+    <w:lsdException w:name="Grid Table 6 Colorful" w:uiPriority="51"/>
+    <w:lsdException w:name="Grid Table 7 Colorful" w:uiPriority="52"/>
+    <w:lsdException w:name="Grid Table 1 Light Accent 1" w:uiPriority="46"/>
+    <w:lsdException w:name="Grid Table 2 Accent 1" w:uiPriority="47"/>
+    <w:lsdException w:name="Grid Table 3 Accent 1" w:uiPriority="48"/>
+    <w:lsdException w:name="Grid Table 4 Accent 1" w:uiPriority="49"/>
+    <w:lsdException w:name="Grid Table 5 Dark Accent 1" w:uiPriority="50"/>
+    <w:lsdException w:name="Grid Table 6 Colorful Accent 1" w:uiPriority="51"/>
+    <w:lsdException w:name="Grid Table 7 Colorful Accent 1" w:uiPriority="52"/>
+    <w:lsdException w:name="Grid Table 1 Light Accent 2" w:uiPriority="46"/>
+    <w:lsdException w:name="Grid Table 2 Accent 2" w:uiPriority="47"/>
+    <w:lsdException w:name="Grid Table 3 Accent 2" w:uiPriority="48"/>
+    <w:lsdException w:name="Grid Table 4 Accent 2" w:uiPriority="49"/>
+    <w:lsdException w:name="Grid Table 5 Dark Accent 2" w:uiPriority="50"/>
+    <w:lsdException w:name="Grid Table 6 Colorful Accent 2" w:uiPriority="51"/>
+    <w:lsdException w:name="Grid Table 7 Colorful Accent 2" w:uiPriority="52"/>
+    <w:lsdException w:name="Grid Table 1 Light Accent 3" w:uiPriority="46"/>
+    <w:lsdException w:name="Grid Table 2 Accent 3" w:uiPriority="47"/>
+    <w:lsdException w:name="Grid Table 3 Accent 3" w:uiPriority="48"/>
+    <w:lsdException w:name="Grid Table 4 Accent 3" w:uiPriority="49"/>
+    <w:lsdException w:name="Grid Table 5 Dark Accent 3" w:uiPriority="50"/>
+    <w:lsdException w:name="Grid Table 6 Colorful Accent 3" w:uiPriority="51"/>
+    <w:lsdException w:name="Grid Table 7 Colorful Accent 3" w:uiPriority="52"/>
+    <w:lsdException w:name="Grid Table 1 Light Accent 4" w:uiPriority="46"/>
+    <w:lsdException w:name="Grid Table 2 Accent 4" w:uiPriority="47"/>
+    <w:lsdException w:name="Grid Table 3 Accent 4" w:uiPriority="48"/>
+    <w:lsdException w:name="Grid Table 4 Accent 4" w:uiPriority="49"/>
+    <w:lsdException w:name="Grid Table 5 Dark Accent 4" w:uiPriority="50"/>
+    <w:lsdException w:name="Grid Table 6 Colorful Accent 4" w:uiPriority="51"/>
+    <w:lsdException w:name="Grid Table 7 Colorful Accent 4" w:uiPriority="52"/>
+    <w:lsdException w:name="Grid Table 1 Light Accent 5" w:uiPriority="46"/>
+    <w:lsdException w:name="Grid Table 2 Accent 5" w:uiPriority="47"/>
+    <w:lsdException w:name="Grid Table 3 Accent 5" w:uiPriority="48"/>
+    <w:lsdException w:name="Grid Table 4 Accent 5" w:uiPriority="49"/>
+    <w:lsdException w:name="Grid Table 5 Dark Accent 5" w:uiPriority="50"/>
+    <w:lsdException w:name="Grid Table 6 Colorful Accent 5" w:uiPriority="51"/>
+    <w:lsdException w:name="Grid Table 7 Colorful Accent 5" w:uiPriority="52"/>
+    <w:lsdException w:name="Grid Table 1 Light Accent 6" w:uiPriority="46"/>
+    <w:lsdException w:name="Grid Table 2 Accent 6" w:uiPriority="47"/>
+    <w:lsdException w:name="Grid Table 3 Accent 6" w:uiPriority="48"/>
+    <w:lsdException w:name="Grid Table 4 Accent 6" w:uiPriority="49"/>
+    <w:lsdException w:name="Grid Table 5 Dark Accent 6" w:uiPriority="50"/>
+    <w:lsdException w:name="Grid Table 6 Colorful Accent 6" w:uiPriority="51"/>
+    <w:lsdException w:name="Grid Table 7 Colorful Accent 6" w:uiPriority="52"/>
+    <w:lsdException w:name="List Table 1 Light" w:uiPriority="46"/>
+    <w:lsdException w:name="List Table 2" w:uiPriority="47"/>
+    <w:lsdException w:name="List Table 3" w:uiPriority="48"/>
+    <w:lsdException w:name="List Table 4" w:uiPriority="49"/>
+    <w:lsdException w:name="List Table 5 Dark" w:uiPriority="50"/>
+    <w:lsdException w:name="List Table 6 Colorful" w:uiPriority="51"/>
+    <w:lsdException w:name="List Table 7 Colorful" w:uiPriority="52"/>
+    <w:lsdException w:name="List Table 1 Light Accent 1" w:uiPriority="46"/>
+    <w:lsdException w:name="List Table 2 Accent 1" w:uiPriority="47"/>
+    <w:lsdException w:name="List Table 3 Accent 1" w:uiPriority="48"/>
+    <w:lsdException w:name="List Table 4 Accent 1" w:uiPriority="49"/>
+    <w:lsdException w:name="List Table 5 Dark Accent 1" w:uiPriority="50"/>
+    <w:lsdException w:name="List Table 6 Colorful Accent 1" w:uiPriority="51"/>
+    <w:lsdException w:name="List Table 7 Colorful Accent 1" w:uiPriority="52"/>
+    <w:lsdException w:name="List Table 1 Light Accent 2" w:uiPriority="46"/>
+    <w:lsdException w:name="List Table 2 Accent 2" w:uiPriority="47"/>
+    <w:lsdException w:name="List Table 3 Accent 2" w:uiPriority="48"/>
+    <w:lsdException w:name="List Table 4 Accent 2" w:uiPriority="49"/>
+    <w:lsdException w:name="List Table 5 Dark Accent 2" w:uiPriority="50"/>
+    <w:lsdException w:name="List Table 6 Colorful Accent 2" w:uiPriority="51"/>
+    <w:lsdException w:name="List Table 7 Colorful Accent 2" w:uiPriority="52"/>
+    <w:lsdException w:name="List Table 1 Light Accent 3" w:uiPriority="46"/>
+    <w:lsdException w:name="List Table 2 Accent 3" w:uiPriority="47"/>
+    <w:lsdException w:name="List Table 3 Accent 3" w:uiPriority="48"/>
+    <w:lsdException w:name="List Table 4 Accent 3" w:uiPriority="49"/>
+    <w:lsdException w:name="List Table 5 Dark Accent 3" w:uiPriority="50"/>
+    <w:lsdException w:name="List Table 6 Colorful Accent 3" w:uiPriority="51"/>
+    <w:lsdException w:name="List Table 7 Colorful Accent 3" w:uiPriority="52"/>
+    <w:lsdException w:name="List Table 1 Light Accent 4" w:uiPriority="46"/>
+    <w:lsdException w:name="List Table 2 Accent 4" w:uiPriority="47"/>
+    <w:lsdException w:name="List Table 3 Accent 4" w:uiPriority="48"/>
+    <w:lsdException w:name="List Table 4 Accent 4" w:uiPriority="49"/>
+    <w:lsdException w:name="List Table 5 Dark Accent 4" w:uiPriority="50"/>
+    <w:lsdException w:name="List Table 6 Colorful Accent 4" w:uiPriority="51"/>
+    <w:lsdException w:name="List Table 7 Colorful Accent 4" w:uiPriority="52"/>
+    <w:lsdException w:name="List Table 1 Light Accent 5" w:uiPriority="46"/>
+    <w:lsdException w:name="List Table 2 Accent 5" w:uiPriority="47"/>
+    <w:lsdException w:name="List Table 3 Accent 5" w:uiPriority="48"/>
+    <w:lsdException w:name="List Table 4 Accent 5" w:uiPriority="49"/>
+    <w:lsdException w:name="List Table 5 Dark Accent 5" w:uiPriority="50"/>
+    <w:lsdException w:name="List Table 6 Colorful Accent 5" w:uiPriority="51"/>
+    <w:lsdException w:name="List Table 7 Colorful Accent 5" w:uiPriority="52"/>
+    <w:lsdException w:name="List Table 1 Light Accent 6" w:uiPriority="46"/>
+    <w:lsdException w:name="List Table 2 Accent 6" w:uiPriority="47"/>
+    <w:lsdException w:name="List Table 3 Accent 6" w:uiPriority="48"/>
+    <w:lsdException w:name="List Table 4 Accent 6" w:uiPriority="49"/>
+    <w:lsdException w:name="List Table 5 Dark Accent 6" w:uiPriority="50"/>
+    <w:lsdException w:name="List Table 6 Colorful Accent 6" w:uiPriority="51"/>
+    <w:lsdException w:name="List Table 7 Colorful Accent 6" w:uiPriority="52"/>
+    <w:lsdException w:name="Mention" w:semiHidden="1" w:unhideWhenUsed="1"/>
+    <w:lsdException w:name="Smart Hyperlink" w:semiHidden="1" w:unhideWhenUsed="1"/>
+    <w:lsdException w:name="Hashtag" w:semiHidden="1" w:unhideWhenUsed="1"/>
+    <w:lsdException w:name="Unresolved Mention" w:semiHidden="1" w:unhideWhenUsed="1"/>
+    <w:lsdException w:name="Smart Link" w:semiHidden="1" w:unhideWhenUsed="1"/>
+  </w:latentStyles>
+  <w:style w:type="paragraph" w:default="1" w:styleId="Normal">
     <w:name w:val="Normal"/>
     <w:qFormat/>
   </w:style>
-  <w:style w:type="table" w:styleId="TableNormal" w:default="true">
+  <w:style w:type="paragraph" w:styleId="Ttulo1">
+    <w:name w:val="heading 1"/>
+    <w:basedOn w:val="Normal"/>
+    <w:next w:val="Normal"/>
+    <w:uiPriority w:val="9"/>
+    <w:qFormat/>
+    <w:pPr>
+      <w:outlineLvl w:val="0"/>
+    </w:pPr>
+    <w:rPr>
+      <w:color w:val="2E74B5"/>
+      <w:sz w:val="32"/>
+      <w:szCs w:val="32"/>
+    </w:rPr>
+  </w:style>
+  <w:style w:type="paragraph" w:styleId="Ttulo2">
+    <w:name w:val="heading 2"/>
+    <w:basedOn w:val="Normal"/>
+    <w:next w:val="Normal"/>
+    <w:uiPriority w:val="9"/>
+    <w:semiHidden/>
+    <w:unhideWhenUsed/>
+    <w:qFormat/>
+    <w:pPr>
+      <w:outlineLvl w:val="1"/>
+    </w:pPr>
+    <w:rPr>
+      <w:color w:val="2E74B5"/>
+      <w:sz w:val="26"/>
+      <w:szCs w:val="26"/>
+    </w:rPr>
+  </w:style>
+  <w:style w:type="paragraph" w:styleId="Ttulo3">
+    <w:name w:val="heading 3"/>
+    <w:basedOn w:val="Normal"/>
+    <w:next w:val="Normal"/>
+    <w:uiPriority w:val="9"/>
+    <w:semiHidden/>
+    <w:unhideWhenUsed/>
+    <w:qFormat/>
+    <w:pPr>
+      <w:outlineLvl w:val="2"/>
+    </w:pPr>
+    <w:rPr>
+      <w:color w:val="1F4D78"/>
+      <w:sz w:val="24"/>
+      <w:szCs w:val="24"/>
+    </w:rPr>
+  </w:style>
+  <w:style w:type="paragraph" w:styleId="Ttulo4">
+    <w:name w:val="heading 4"/>
+    <w:basedOn w:val="Normal"/>
+    <w:next w:val="Normal"/>
+    <w:uiPriority w:val="9"/>
+    <w:semiHidden/>
+    <w:unhideWhenUsed/>
+    <w:qFormat/>
+    <w:pPr>
+      <w:outlineLvl w:val="3"/>
+    </w:pPr>
+    <w:rPr>
+      <w:i/>
+      <w:iCs/>
+      <w:color w:val="2E74B5"/>
+    </w:rPr>
+  </w:style>
+  <w:style w:type="paragraph" w:styleId="Ttulo5">
+    <w:name w:val="heading 5"/>
+    <w:basedOn w:val="Normal"/>
+    <w:next w:val="Normal"/>
+    <w:uiPriority w:val="9"/>
+    <w:semiHidden/>
+    <w:unhideWhenUsed/>
+    <w:qFormat/>
+    <w:pPr>
+      <w:outlineLvl w:val="4"/>
+    </w:pPr>
+    <w:rPr>
+      <w:color w:val="2E74B5"/>
+    </w:rPr>
+  </w:style>
+  <w:style w:type="paragraph" w:styleId="Ttulo6">
+    <w:name w:val="heading 6"/>
+    <w:basedOn w:val="Normal"/>
+    <w:next w:val="Normal"/>
+    <w:uiPriority w:val="9"/>
+    <w:semiHidden/>
+    <w:unhideWhenUsed/>
+    <w:qFormat/>
+    <w:pPr>
+      <w:outlineLvl w:val="5"/>
+    </w:pPr>
+    <w:rPr>
+      <w:color w:val="1F4D78"/>
+    </w:rPr>
+  </w:style>
+  <w:style w:type="character" w:default="1" w:styleId="Fuentedeprrafopredeter">
+    <w:name w:val="Default Paragraph Font"/>
+    <w:uiPriority w:val="1"/>
+    <w:semiHidden/>
+    <w:unhideWhenUsed/>
+  </w:style>
+  <w:style w:type="table" w:default="1" w:styleId="Tablanormal">
     <w:name w:val="Normal Table"/>
     <w:uiPriority w:val="99"/>
     <w:semiHidden/>
     <w:unhideWhenUsed/>
     <w:tblPr>
-      <w:tblInd w:type="dxa" w:w="0"/>
+      <w:tblInd w:w="0" w:type="dxa"/>
       <w:tblCellMar>
-        <w:top w:type="dxa" w:w="0"/>
-        <w:left w:type="dxa" w:w="108"/>
-        <w:bottom w:type="dxa" w:w="0"/>
-        <w:right w:type="dxa" w:w="108"/>
+        <w:top w:w="0" w:type="dxa"/>
+        <w:left w:w="108" w:type="dxa"/>
+        <w:bottom w:w="0" w:type="dxa"/>
+        <w:right w:w="108" w:type="dxa"/>
       </w:tblCellMar>
     </w:tblPr>
   </w:style>
-  <w:style w:type="paragraph" w:styleId="Title">
+  <w:style w:type="numbering" w:default="1" w:styleId="Sinlista">
+    <w:name w:val="No List"/>
+    <w:uiPriority w:val="99"/>
+    <w:semiHidden/>
+    <w:unhideWhenUsed/>
+  </w:style>
+  <w:style w:type="paragraph" w:styleId="Ttulo">
     <w:name w:val="Title"/>
     <w:basedOn w:val="Normal"/>
     <w:next w:val="Normal"/>
+    <w:uiPriority w:val="10"/>
     <w:qFormat/>
     <w:rPr>
       <w:sz w:val="56"/>
       <w:szCs w:val="56"/>
     </w:rPr>
   </w:style>
-  <w:style w:type="paragraph" w:styleId="Heading1">
-    <w:name w:val="Heading 1"/>
-    <w:basedOn w:val="Normal"/>
-    <w:next w:val="Normal"/>
-    <w:qFormat/>
-    <w:rPr>
-      <w:color w:val="2E74B5"/>
-      <w:sz w:val="32"/>
-      <w:szCs w:val="32"/>
-    </w:rPr>
-  </w:style>
-  <w:style w:type="paragraph" w:styleId="Heading2">
-    <w:name w:val="Heading 2"/>
-    <w:basedOn w:val="Normal"/>
-    <w:next w:val="Normal"/>
-    <w:qFormat/>
-    <w:rPr>
-      <w:color w:val="2E74B5"/>
-      <w:sz w:val="26"/>
-      <w:szCs w:val="26"/>
-    </w:rPr>
-  </w:style>
-  <w:style w:type="paragraph" w:styleId="Heading3">
-    <w:name w:val="Heading 3"/>
-    <w:basedOn w:val="Normal"/>
-    <w:next w:val="Normal"/>
-    <w:qFormat/>
-    <w:rPr>
-      <w:color w:val="1F4D78"/>
-      <w:sz w:val="24"/>
-      <w:szCs w:val="24"/>
-    </w:rPr>
-  </w:style>
-  <w:style w:type="paragraph" w:styleId="Heading4">
-    <w:name w:val="Heading 4"/>
-    <w:basedOn w:val="Normal"/>
-    <w:next w:val="Normal"/>
-    <w:qFormat/>
-    <w:rPr>
-      <w:i/>
-      <w:iCs/>
-      <w:color w:val="2E74B5"/>
-    </w:rPr>
-  </w:style>
-  <w:style w:type="paragraph" w:styleId="Heading5">
-    <w:name w:val="Heading 5"/>
-    <w:basedOn w:val="Normal"/>
-    <w:next w:val="Normal"/>
-    <w:qFormat/>
-    <w:rPr>
-      <w:color w:val="2E74B5"/>
-    </w:rPr>
-  </w:style>
-  <w:style w:type="paragraph" w:styleId="Heading6">
-    <w:name w:val="Heading 6"/>
-    <w:basedOn w:val="Normal"/>
-    <w:next w:val="Normal"/>
-    <w:qFormat/>
-    <w:rPr>
-      <w:color w:val="1F4D78"/>
-    </w:rPr>
-  </w:style>
-  <w:style w:type="paragraph" w:styleId="Strong">
-    <w:name w:val="Strong"/>
+  <w:style w:type="paragraph" w:customStyle="1" w:styleId="Fuerte1">
+    <w:name w:val="Fuerte1"/>
     <w:basedOn w:val="Normal"/>
     <w:next w:val="Normal"/>
     <w:qFormat/>
@@ -743,12 +1513,12 @@
       <w:bCs/>
     </w:rPr>
   </w:style>
-  <w:style w:type="paragraph" w:styleId="ListParagraph">
+  <w:style w:type="paragraph" w:styleId="Prrafodelista">
     <w:name w:val="List Paragraph"/>
     <w:basedOn w:val="Normal"/>
     <w:qFormat/>
   </w:style>
-  <w:style w:type="paragraph" w:styleId="Caption">
+  <w:style w:type="paragraph" w:styleId="Descripcin">
     <w:name w:val="caption"/>
     <w:basedOn w:val="Normal"/>
     <w:next w:val="Normal"/>
@@ -767,14 +1537,14 @@
       <w:szCs w:val="18"/>
     </w:rPr>
   </w:style>
-  <w:style w:type="paragraph" w:styleId="Bibliography">
+  <w:style w:type="paragraph" w:styleId="Bibliografa">
     <w:name w:val="Bibliography"/>
     <w:basedOn w:val="Normal"/>
     <w:next w:val="Normal"/>
     <w:uiPriority w:val="37"/>
     <w:unhideWhenUsed/>
   </w:style>
-  <w:style w:type="paragraph" w:styleId="TOC1">
+  <w:style w:type="paragraph" w:styleId="TDC1">
     <w:name w:val="toc 1"/>
     <w:basedOn w:val="Normal"/>
     <w:next w:val="Normal"/>
@@ -785,7 +1555,7 @@
       <w:spacing w:after="100"/>
     </w:pPr>
   </w:style>
-  <w:style w:type="paragraph" w:styleId="TOC2">
+  <w:style w:type="paragraph" w:styleId="TDC2">
     <w:name w:val="toc 2"/>
     <w:basedOn w:val="Normal"/>
     <w:next w:val="Normal"/>
@@ -797,7 +1567,7 @@
       <w:ind w:left="210"/>
     </w:pPr>
   </w:style>
-  <w:style w:type="paragraph" w:styleId="TOC3">
+  <w:style w:type="paragraph" w:styleId="TDC3">
     <w:name w:val="toc 3"/>
     <w:basedOn w:val="Normal"/>
     <w:next w:val="Normal"/>
@@ -809,7 +1579,7 @@
       <w:ind w:left="420"/>
     </w:pPr>
   </w:style>
-  <w:style w:type="paragraph" w:styleId="TOC4">
+  <w:style w:type="paragraph" w:styleId="TDC4">
     <w:name w:val="toc 4"/>
     <w:basedOn w:val="Normal"/>
     <w:next w:val="Normal"/>
@@ -821,7 +1591,7 @@
       <w:ind w:left="630"/>
     </w:pPr>
   </w:style>
-  <w:style w:type="paragraph" w:styleId="TOC5">
+  <w:style w:type="paragraph" w:styleId="TDC5">
     <w:name w:val="toc 5"/>
     <w:basedOn w:val="Normal"/>
     <w:next w:val="Normal"/>
@@ -833,7 +1603,7 @@
       <w:ind w:left="840"/>
     </w:pPr>
   </w:style>
-  <w:style w:type="paragraph" w:styleId="TOC6">
+  <w:style w:type="paragraph" w:styleId="TDC6">
     <w:name w:val="toc 6"/>
     <w:basedOn w:val="Normal"/>
     <w:next w:val="Normal"/>
@@ -845,7 +1615,7 @@
       <w:ind w:left="1050"/>
     </w:pPr>
   </w:style>
-  <w:style w:type="paragraph" w:styleId="TOC7">
+  <w:style w:type="paragraph" w:styleId="TDC7">
     <w:name w:val="toc 7"/>
     <w:basedOn w:val="Normal"/>
     <w:next w:val="Normal"/>
@@ -857,7 +1627,7 @@
       <w:ind w:left="1260"/>
     </w:pPr>
   </w:style>
-  <w:style w:type="paragraph" w:styleId="TOC8">
+  <w:style w:type="paragraph" w:styleId="TDC8">
     <w:name w:val="toc 8"/>
     <w:basedOn w:val="Normal"/>
     <w:next w:val="Normal"/>
@@ -869,7 +1639,7 @@
       <w:ind w:left="1470"/>
     </w:pPr>
   </w:style>
-  <w:style w:type="paragraph" w:styleId="TOC9">
+  <w:style w:type="paragraph" w:styleId="TDC9">
     <w:name w:val="toc 9"/>
     <w:basedOn w:val="Normal"/>
     <w:next w:val="Normal"/>
@@ -881,9 +1651,8 @@
       <w:ind w:left="1680"/>
     </w:pPr>
   </w:style>
-  <w:style w:type="character" w:styleId="Hyperlink">
+  <w:style w:type="character" w:styleId="Hipervnculo">
     <w:name w:val="Hyperlink"/>
-    <w:basedOn w:val="DefaultParagraphFont"/>
     <w:uiPriority w:val="99"/>
     <w:unhideWhenUsed/>
     <w:rPr>
@@ -891,9 +1660,8 @@
       <w:u w:val="single"/>
     </w:rPr>
   </w:style>
-  <w:style w:type="character" w:styleId="FootnoteReference">
+  <w:style w:type="character" w:styleId="Refdenotaalpie">
     <w:name w:val="footnote reference"/>
-    <w:basedOn w:val="DefaultParagraphFont"/>
     <w:uiPriority w:val="99"/>
     <w:semiHidden/>
     <w:unhideWhenUsed/>
@@ -901,25 +1669,21 @@
       <w:vertAlign w:val="superscript"/>
     </w:rPr>
   </w:style>
-  <w:style w:type="paragraph" w:styleId="FootnoteText">
+  <w:style w:type="paragraph" w:styleId="Textonotapie">
     <w:name w:val="footnote text"/>
     <w:basedOn w:val="Normal"/>
-    <w:link w:val="FootnoteTextChar"/>
+    <w:link w:val="TextonotapieCar"/>
     <w:uiPriority w:val="99"/>
     <w:semiHidden/>
     <w:unhideWhenUsed/>
-    <w:pPr>
-      <w:spacing w:after="0" w:line="240" w:lineRule="auto"/>
-    </w:pPr>
     <w:rPr>
       <w:sz w:val="20"/>
       <w:szCs w:val="20"/>
     </w:rPr>
   </w:style>
-  <w:style w:type="character" w:styleId="FootnoteTextChar">
-    <w:name w:val="Footnote Text Char"/>
-    <w:basedOn w:val="DefaultParagraphFont"/>
-    <w:link w:val="FootnoteText"/>
+  <w:style w:type="character" w:customStyle="1" w:styleId="TextonotapieCar">
+    <w:name w:val="Texto nota pie Car"/>
+    <w:link w:val="Textonotapie"/>
     <w:uiPriority w:val="99"/>
     <w:semiHidden/>
     <w:unhideWhenUsed/>
@@ -928,9 +1692,8 @@
       <w:szCs w:val="20"/>
     </w:rPr>
   </w:style>
-  <w:style w:type="character" w:styleId="EndnoteReference">
+  <w:style w:type="character" w:styleId="Refdenotaalfinal">
     <w:name w:val="endnote reference"/>
-    <w:basedOn w:val="DefaultParagraphFont"/>
     <w:uiPriority w:val="99"/>
     <w:semiHidden/>
     <w:unhideWhenUsed/>
@@ -938,25 +1701,21 @@
       <w:vertAlign w:val="superscript"/>
     </w:rPr>
   </w:style>
-  <w:style w:type="paragraph" w:styleId="EndnoteText">
+  <w:style w:type="paragraph" w:styleId="Textonotaalfinal">
     <w:name w:val="endnote text"/>
     <w:basedOn w:val="Normal"/>
-    <w:link w:val="EndnoteTextChar"/>
+    <w:link w:val="TextonotaalfinalCar"/>
     <w:uiPriority w:val="99"/>
     <w:semiHidden/>
     <w:unhideWhenUsed/>
-    <w:pPr>
-      <w:spacing w:after="0" w:line="240" w:lineRule="auto"/>
-    </w:pPr>
     <w:rPr>
       <w:sz w:val="20"/>
       <w:szCs w:val="20"/>
     </w:rPr>
   </w:style>
-  <w:style w:type="character" w:styleId="EndnoteTextChar">
-    <w:name w:val="Endnote Text Char"/>
-    <w:basedOn w:val="DefaultParagraphFont"/>
-    <w:link w:val="EndnoteText"/>
+  <w:style w:type="character" w:customStyle="1" w:styleId="TextonotaalfinalCar">
+    <w:name w:val="Texto nota al final Car"/>
+    <w:link w:val="Textonotaalfinal"/>
     <w:uiPriority w:val="99"/>
     <w:semiHidden/>
     <w:unhideWhenUsed/>
@@ -965,12 +1724,53 @@
       <w:szCs w:val="20"/>
     </w:rPr>
   </w:style>
-  <w:style w:type="character" w:styleId="LineNumber">
+  <w:style w:type="character" w:styleId="Nmerodelnea">
     <w:name w:val="line number"/>
-    <w:basedOn w:val="DefaultParagraphFont"/>
     <w:uiPriority w:val="99"/>
     <w:semiHidden/>
     <w:unhideWhenUsed/>
+  </w:style>
+  <w:style w:type="paragraph" w:styleId="Encabezado">
+    <w:name w:val="header"/>
+    <w:basedOn w:val="Normal"/>
+    <w:link w:val="EncabezadoCar"/>
+    <w:uiPriority w:val="99"/>
+    <w:unhideWhenUsed/>
+    <w:rsid w:val="008D617A"/>
+    <w:pPr>
+      <w:tabs>
+        <w:tab w:val="center" w:pos="4252"/>
+        <w:tab w:val="right" w:pos="8504"/>
+      </w:tabs>
+    </w:pPr>
+  </w:style>
+  <w:style w:type="character" w:customStyle="1" w:styleId="EncabezadoCar">
+    <w:name w:val="Encabezado Car"/>
+    <w:basedOn w:val="Fuentedeprrafopredeter"/>
+    <w:link w:val="Encabezado"/>
+    <w:uiPriority w:val="99"/>
+    <w:rsid w:val="008D617A"/>
+  </w:style>
+  <w:style w:type="paragraph" w:styleId="Piedepgina">
+    <w:name w:val="footer"/>
+    <w:basedOn w:val="Normal"/>
+    <w:link w:val="PiedepginaCar"/>
+    <w:uiPriority w:val="99"/>
+    <w:unhideWhenUsed/>
+    <w:rsid w:val="008D617A"/>
+    <w:pPr>
+      <w:tabs>
+        <w:tab w:val="center" w:pos="4252"/>
+        <w:tab w:val="right" w:pos="8504"/>
+      </w:tabs>
+    </w:pPr>
+  </w:style>
+  <w:style w:type="character" w:customStyle="1" w:styleId="PiedepginaCar">
+    <w:name w:val="Pie de página Car"/>
+    <w:basedOn w:val="Fuentedeprrafopredeter"/>
+    <w:link w:val="Piedepgina"/>
+    <w:uiPriority w:val="99"/>
+    <w:rsid w:val="008D617A"/>
   </w:style>
 </w:styles>
 </file>
@@ -1127,7 +1927,7 @@
         <a:solidFill>
           <a:schemeClr val="phClr"/>
         </a:solidFill>
-        <a:gradFill rotWithShape="true">
+        <a:gradFill rotWithShape="1">
           <a:gsLst>
             <a:gs pos="0">
               <a:schemeClr val="phClr">
@@ -1151,9 +1951,9 @@
               </a:schemeClr>
             </a:gs>
           </a:gsLst>
-          <a:lin ang="5400000" scaled="false"/>
+          <a:lin ang="5400000" scaled="0"/>
         </a:gradFill>
-        <a:gradFill rotWithShape="true">
+        <a:gradFill rotWithShape="1">
           <a:gsLst>
             <a:gs pos="0">
               <a:schemeClr val="phClr">
@@ -1177,7 +1977,7 @@
               </a:schemeClr>
             </a:gs>
           </a:gsLst>
-          <a:lin ang="5400000" scaled="false"/>
+          <a:lin ang="5400000" scaled="0"/>
         </a:gradFill>
       </a:fillStyleLst>
       <a:lnStyleLst>
@@ -1212,7 +2012,7 @@
         </a:effectStyle>
         <a:effectStyle>
           <a:effectLst>
-            <a:outerShdw blurRad="57150" dist="19050" dir="5400000" algn="ctr" rotWithShape="false">
+            <a:outerShdw blurRad="57150" dist="19050" dir="5400000" algn="ctr" rotWithShape="0">
               <a:srgbClr val="000000">
                 <a:alpha val="63000"/>
               </a:srgbClr>
@@ -1230,7 +2030,7 @@
             <a:satMod val="170000"/>
           </a:schemeClr>
         </a:solidFill>
-        <a:gradFill rotWithShape="true">
+        <a:gradFill rotWithShape="1">
           <a:gsLst>
             <a:gs pos="0">
               <a:schemeClr val="phClr">
@@ -1255,7 +2055,7 @@
               </a:schemeClr>
             </a:gs>
           </a:gsLst>
-          <a:lin ang="5400000" scaled="false"/>
+          <a:lin ang="5400000" scaled="0"/>
         </a:gradFill>
       </a:bgFillStyleLst>
     </a:fmtScheme>

</xml_diff>